<commit_message>
Use the three campus appointment letters; campus now picks the contract template
Gombe, Abuja and Keffi templates are built from the client's own letters with
fill-in fields; optional net salary line; template dropdown removed.

Co-Authored-By: Claude Sonnet 5.5 <noreply@anthropic.com>
</commit_message>
<xml_diff>
--- a/contract-templates/Abuja_Template.docx
+++ b/contract-templates/Abuja_Template.docx
@@ -25,16 +25,16 @@
           <w:lang w:val="en-US"/>
         </w:rPr>
         <w:drawing>
-          <wp:anchor distT="0" distB="0" distL="114300" distR="114300" simplePos="0" relativeHeight="251660288" behindDoc="1" locked="0" layoutInCell="1" allowOverlap="1">
+          <wp:anchor distT="0" distB="0" distL="114300" distR="114300" simplePos="0" relativeHeight="251660288" behindDoc="1" locked="0" layoutInCell="1" allowOverlap="1" wp14:anchorId="153606EE" wp14:editId="54B48B56">
             <wp:simplePos x="0" y="0"/>
             <wp:positionH relativeFrom="column">
-              <wp:posOffset>-290223</wp:posOffset>
+              <wp:posOffset>-573878</wp:posOffset>
             </wp:positionH>
             <wp:positionV relativeFrom="paragraph">
-              <wp:posOffset>-550628</wp:posOffset>
+              <wp:posOffset>-717550</wp:posOffset>
             </wp:positionV>
-            <wp:extent cx="7370672" cy="9652635"/>
-            <wp:effectExtent l="0" t="0" r="1905" b="5715"/>
+            <wp:extent cx="7655441" cy="10062812"/>
+            <wp:effectExtent l="0" t="0" r="3175" b="0"/>
             <wp:wrapNone/>
             <wp:docPr id="1" name="Picture 1"/>
             <wp:cNvGraphicFramePr>
@@ -44,7 +44,7 @@
               <a:graphicData uri="http://schemas.openxmlformats.org/drawingml/2006/picture">
                 <pic:pic xmlns:pic="http://schemas.openxmlformats.org/drawingml/2006/picture">
                   <pic:nvPicPr>
-                    <pic:cNvPr id="1" name="GOMBE LETTER HEAD_page-0001.jpg"/>
+                    <pic:cNvPr id="0" name="LCSMT LETTERHEAD - NEW 1111111111111111_page-0001.jpg"/>
                     <pic:cNvPicPr/>
                   </pic:nvPicPr>
                   <pic:blipFill>
@@ -62,7 +62,7 @@
                   <pic:spPr>
                     <a:xfrm>
                       <a:off x="0" y="0"/>
-                      <a:ext cx="7374535" cy="9657694"/>
+                      <a:ext cx="7655441" cy="10062812"/>
                     </a:xfrm>
                     <a:prstGeom prst="rect">
                       <a:avLst/>
@@ -154,8 +154,9 @@
         <w:jc w:val="both"/>
         <w:rPr>
           <w:rFonts w:ascii="Times New Roman" w:eastAsia="Arial" w:hAnsi="Times New Roman" w:cs="Times New Roman"/>
-          <w:sz w:val="32"/>
-          <w:szCs w:val="24"/>
+          <w:b/>
+          <w:sz w:val="24"/>
+          <w:szCs w:val="20"/>
         </w:rPr>
       </w:pPr>
       <w:r>
@@ -165,6 +166,22 @@
           <w:szCs w:val="20"/>
         </w:rPr>
         <w:t xml:space="preserve">${date}</w:t>
+      </w:r>
+      <w:r>
+        <w:rPr>
+          <w:rFonts w:ascii="Times New Roman" w:eastAsia="Arial" w:hAnsi="Times New Roman" w:cs="Times New Roman"/>
+          <w:sz w:val="24"/>
+          <w:szCs w:val="20"/>
+        </w:rPr>
+        <w:t xml:space="preserve"/>
+      </w:r>
+      <w:r>
+        <w:rPr>
+          <w:rFonts w:ascii="Times New Roman" w:eastAsia="Arial" w:hAnsi="Times New Roman" w:cs="Times New Roman"/>
+          <w:sz w:val="24"/>
+          <w:szCs w:val="20"/>
+        </w:rPr>
+        <w:t xml:space="preserve"/>
       </w:r>
       <w:r>
         <w:rPr>
@@ -214,7 +231,6 @@
           <w:bCs/>
           <w:sz w:val="24"/>
           <w:szCs w:val="20"/>
-          <w:lang w:val="en-US"/>
         </w:rPr>
       </w:pPr>
       <w:r>
@@ -222,67 +238,75 @@
           <w:rFonts w:ascii="Times New Roman" w:eastAsia="Arial" w:hAnsi="Times New Roman" w:cs="Times New Roman"/>
           <w:b/>
           <w:bCs/>
+          <w:sz w:val="24"/>
+          <w:szCs w:val="20"/>
+        </w:rPr>
+        <w:t xml:space="preserve">${name_caps}</w:t>
+      </w:r>
+    </w:p>
+    <w:p>
+      <w:pPr>
+        <w:pStyle w:val="Normal1"/>
+        <w:spacing w:after="0" w:line="240" w:lineRule="auto"/>
+        <w:jc w:val="both"/>
+        <w:rPr>
+          <w:rFonts w:ascii="Times New Roman" w:hAnsi="Times New Roman" w:cs="Times New Roman"/>
           <w:sz w:val="24"/>
           <w:szCs w:val="20"/>
           <w:lang w:val="en-US"/>
         </w:rPr>
-        <w:t xml:space="preserve">${name_caps}</w:t>
-      </w:r>
-    </w:p>
-    <w:p>
-      <w:pPr>
-        <w:pStyle w:val="Normal1"/>
-        <w:widowControl w:val="0"/>
-        <w:spacing w:after="0" w:line="240" w:lineRule="auto"/>
-        <w:jc w:val="both"/>
+      </w:pPr>
+      <w:r>
         <w:rPr>
           <w:rFonts w:ascii="Times New Roman" w:hAnsi="Times New Roman" w:cs="Times New Roman"/>
           <w:sz w:val="24"/>
           <w:szCs w:val="20"/>
           <w:lang w:val="en-US"/>
         </w:rPr>
-      </w:pPr>
-      <w:r>
-        <w:rPr>
-          <w:rFonts w:ascii="Times New Roman" w:hAnsi="Times New Roman" w:cs="Times New Roman"/>
+        <w:t xml:space="preserve">${address}</w:t>
+      </w:r>
+    </w:p>
+    <w:p>
+      <w:pPr>
+        <w:pStyle w:val="Normal1"/>
+        <w:spacing w:line="600" w:lineRule="auto"/>
+        <w:jc w:val="both"/>
+        <w:rPr>
+          <w:rFonts w:ascii="Times New Roman" w:hAnsi="Times New Roman" w:cs="Times New Roman"/>
+          <w:b/>
           <w:sz w:val="24"/>
           <w:szCs w:val="20"/>
-          <w:lang w:val="en-US"/>
-        </w:rPr>
-        <w:t xml:space="preserve">${address}</w:t>
-      </w:r>
-    </w:p>
-    <w:p>
-      <w:pPr>
-        <w:pStyle w:val="Normal1"/>
-        <w:jc w:val="both"/>
+        </w:rPr>
+      </w:pPr>
+      <w:r>
         <w:rPr>
           <w:rFonts w:ascii="Times New Roman" w:eastAsia="Arial" w:hAnsi="Times New Roman" w:cs="Times New Roman"/>
+          <w:b/>
           <w:sz w:val="24"/>
           <w:szCs w:val="20"/>
         </w:rPr>
-      </w:pPr>
-    </w:p>
-    <w:p>
-      <w:pPr>
-        <w:pStyle w:val="Normal1"/>
-        <w:jc w:val="both"/>
+        <w:t xml:space="preserve">Dear </w:t>
+      </w:r>
+      <w:proofErr w:type="spellStart"/>
+      <w:r>
         <w:rPr>
           <w:rFonts w:ascii="Times New Roman" w:hAnsi="Times New Roman" w:cs="Times New Roman"/>
           <w:b/>
           <w:sz w:val="24"/>
           <w:szCs w:val="20"/>
         </w:rPr>
-      </w:pPr>
-      <w:r>
-        <w:rPr>
-          <w:rFonts w:ascii="Times New Roman" w:eastAsia="Arial" w:hAnsi="Times New Roman" w:cs="Times New Roman"/>
+        <w:t xml:space="preserve"/>
+      </w:r>
+      <w:r>
+        <w:rPr>
+          <w:rFonts w:ascii="Times New Roman" w:hAnsi="Times New Roman" w:cs="Times New Roman"/>
           <w:b/>
           <w:sz w:val="24"/>
           <w:szCs w:val="20"/>
         </w:rPr>
-        <w:t xml:space="preserve">Dear </w:t>
-      </w:r>
+        <w:t xml:space="preserve"/>
+      </w:r>
+      <w:proofErr w:type="spellEnd"/>
       <w:r>
         <w:rPr>
           <w:rFonts w:ascii="Times New Roman" w:hAnsi="Times New Roman" w:cs="Times New Roman"/>
@@ -292,17 +316,17 @@
         </w:rPr>
         <w:t xml:space="preserve"/>
       </w:r>
-      <w:r>
-        <w:rPr>
-          <w:rFonts w:ascii="Times New Roman" w:eastAsia="Arial" w:hAnsi="Times New Roman" w:cs="Times New Roman"/>
-          <w:b/>
-          <w:bCs/>
+      <w:proofErr w:type="spellStart"/>
+      <w:r>
+        <w:rPr>
+          <w:rFonts w:ascii="Times New Roman" w:hAnsi="Times New Roman" w:cs="Times New Roman"/>
+          <w:b/>
           <w:sz w:val="24"/>
           <w:szCs w:val="20"/>
-          <w:lang w:val="en-US"/>
         </w:rPr>
         <w:t xml:space="preserve">${name}</w:t>
       </w:r>
+      <w:proofErr w:type="spellEnd"/>
       <w:r>
         <w:rPr>
           <w:rFonts w:ascii="Times New Roman" w:hAnsi="Times New Roman" w:cs="Times New Roman"/>
@@ -312,17 +336,6 @@
         </w:rPr>
         <w:t xml:space="preserve">,</w:t>
       </w:r>
-    </w:p>
-    <w:p>
-      <w:pPr>
-        <w:pStyle w:val="Normal1"/>
-        <w:jc w:val="both"/>
-        <w:rPr>
-          <w:rFonts w:ascii="Times New Roman" w:hAnsi="Times New Roman" w:cs="Times New Roman"/>
-          <w:sz w:val="24"/>
-          <w:szCs w:val="20"/>
-        </w:rPr>
-      </w:pPr>
     </w:p>
     <w:p>
       <w:pPr>
@@ -359,55 +372,22 @@
           <w:rFonts w:ascii="Times New Roman" w:hAnsi="Times New Roman" w:cs="Times New Roman"/>
           <w:sz w:val="24"/>
         </w:rPr>
-        <w:t xml:space="preserve">Congratulations. We are pleased to offer you the position of a </w:t>
-      </w:r>
-      <w:r>
-        <w:rPr>
-          <w:rFonts w:ascii="Times New Roman" w:hAnsi="Times New Roman" w:cs="Times New Roman"/>
-          <w:b/>
-          <w:sz w:val="24"/>
-        </w:rPr>
-        <w:t xml:space="preserve">${position} – ${department} Department</w:t>
-      </w:r>
-      <w:r>
-        <w:rPr>
-          <w:rFonts w:ascii="Times New Roman" w:hAnsi="Times New Roman" w:cs="Times New Roman"/>
-          <w:b/>
-          <w:sz w:val="24"/>
-        </w:rPr>
-        <w:t xml:space="preserve"/>
-      </w:r>
-      <w:r>
-        <w:rPr>
-          <w:rFonts w:ascii="Times New Roman" w:hAnsi="Times New Roman" w:cs="Times New Roman"/>
-          <w:b/>
-          <w:sz w:val="24"/>
-        </w:rPr>
-        <w:t xml:space="preserve"/>
-      </w:r>
-      <w:r>
-        <w:rPr>
-          <w:rFonts w:ascii="Times New Roman" w:hAnsi="Times New Roman" w:cs="Times New Roman"/>
-          <w:b/>
-          <w:sz w:val="24"/>
-        </w:rPr>
-        <w:t xml:space="preserve"/>
-      </w:r>
-      <w:r>
-        <w:rPr>
-          <w:rFonts w:ascii="Times New Roman" w:hAnsi="Times New Roman" w:cs="Times New Roman"/>
-          <w:b/>
-          <w:sz w:val="24"/>
-        </w:rPr>
-        <w:t xml:space="preserve"/>
-      </w:r>
-      <w:r>
-        <w:rPr>
-          <w:rFonts w:ascii="Times New Roman" w:hAnsi="Times New Roman" w:cs="Times New Roman"/>
-          <w:b/>
-          <w:sz w:val="24"/>
-        </w:rPr>
-        <w:t xml:space="preserve"/>
+        <w:t xml:space="preserve">Congratulations. We are please</w:t>
+      </w:r>
+      <w:r>
+        <w:rPr>
+          <w:rFonts w:ascii="Times New Roman" w:hAnsi="Times New Roman" w:cs="Times New Roman"/>
+          <w:sz w:val="24"/>
+        </w:rPr>
+        <w:t xml:space="preserve">d to offer you the position of </w:t>
+      </w:r>
+      <w:r>
+        <w:rPr>
+          <w:rFonts w:ascii="Times New Roman" w:hAnsi="Times New Roman" w:cs="Times New Roman"/>
+          <w:b/>
+          <w:sz w:val="24"/>
+        </w:rPr>
+        <w:t xml:space="preserve">${position} – Department of ${department}</w:t>
       </w:r>
       <w:r>
         <w:rPr>
@@ -522,6 +502,16 @@
         </w:rPr>
         <w:t xml:space="preserve">${end_date}</w:t>
       </w:r>
+      <w:bookmarkStart w:id="0" w:name="_GoBack"/>
+      <w:bookmarkEnd w:id="0"/>
+      <w:r>
+        <w:rPr>
+          <w:rFonts w:ascii="Times New Roman" w:hAnsi="Times New Roman" w:cs="Times New Roman"/>
+          <w:b/>
+          <w:sz w:val="24"/>
+        </w:rPr>
+        <w:t xml:space="preserve"> ${duration}</w:t>
+      </w:r>
       <w:r>
         <w:rPr>
           <w:rFonts w:ascii="Times New Roman" w:hAnsi="Times New Roman" w:cs="Times New Roman"/>
@@ -529,38 +519,6 @@
           <w:sz w:val="24"/>
         </w:rPr>
         <w:t xml:space="preserve"/>
-      </w:r>
-      <w:r>
-        <w:rPr>
-          <w:rFonts w:ascii="Times New Roman" w:hAnsi="Times New Roman" w:cs="Times New Roman"/>
-          <w:b/>
-          <w:sz w:val="24"/>
-        </w:rPr>
-        <w:t xml:space="preserve"/>
-      </w:r>
-      <w:r>
-        <w:rPr>
-          <w:rFonts w:ascii="Times New Roman" w:hAnsi="Times New Roman" w:cs="Times New Roman"/>
-          <w:b/>
-          <w:sz w:val="24"/>
-        </w:rPr>
-        <w:t xml:space="preserve"/>
-      </w:r>
-      <w:r>
-        <w:rPr>
-          <w:rFonts w:ascii="Times New Roman" w:hAnsi="Times New Roman" w:cs="Times New Roman"/>
-          <w:b/>
-          <w:sz w:val="24"/>
-        </w:rPr>
-        <w:t xml:space="preserve"/>
-      </w:r>
-      <w:r>
-        <w:rPr>
-          <w:rFonts w:ascii="Times New Roman" w:hAnsi="Times New Roman" w:cs="Times New Roman"/>
-          <w:b/>
-          <w:sz w:val="24"/>
-        </w:rPr>
-        <w:t xml:space="preserve"> ${duration}</w:t>
       </w:r>
       <w:r>
         <w:rPr>
@@ -584,7 +542,7 @@
         <w:pStyle w:val="ListParagraph"/>
         <w:numPr>
           <w:ilvl w:val="0"/>
-          <w:numId w:val="3"/>
+          <w:numId w:val="2"/>
         </w:numPr>
         <w:rPr>
           <w:rFonts w:ascii="Times New Roman" w:hAnsi="Times New Roman" w:cs="Times New Roman"/>
@@ -607,7 +565,7 @@
         <w:widowControl w:val="0"/>
         <w:numPr>
           <w:ilvl w:val="0"/>
-          <w:numId w:val="3"/>
+          <w:numId w:val="2"/>
         </w:numPr>
         <w:spacing w:after="0" w:line="480" w:lineRule="auto"/>
         <w:jc w:val="both"/>
@@ -759,7 +717,7 @@
           <w:sz w:val="24"/>
           <w:szCs w:val="24"/>
         </w:rPr>
-        <w:t>PhD</w:t>
+        <w:t>Masters</w:t>
       </w:r>
       <w:r>
         <w:rPr>
@@ -849,88 +807,43 @@
           <w:b/>
           <w:sz w:val="24"/>
         </w:rPr>
-        <w:t>Lincoln University Malaysia (</w:t>
-      </w:r>
-      <w:r>
-        <w:rPr>
-          <w:rFonts w:ascii="Times New Roman" w:hAnsi="Times New Roman" w:cs="Times New Roman"/>
-          <w:b/>
-          <w:sz w:val="24"/>
-        </w:rPr>
-        <w:t>Gombe</w:t>
-      </w:r>
-      <w:r>
-        <w:rPr>
-          <w:rFonts w:ascii="Times New Roman" w:hAnsi="Times New Roman" w:cs="Times New Roman"/>
-          <w:b/>
-          <w:sz w:val="24"/>
-        </w:rPr>
-        <w:t xml:space="preserve"> </w:t>
-      </w:r>
-      <w:r>
-        <w:rPr>
-          <w:rFonts w:ascii="Times New Roman" w:hAnsi="Times New Roman" w:cs="Times New Roman"/>
-          <w:b/>
-          <w:sz w:val="24"/>
-        </w:rPr>
-        <w:t xml:space="preserve">Campus) </w:t>
-      </w:r>
-      <w:r>
-        <w:rPr>
-          <w:rFonts w:ascii="Times New Roman" w:hAnsi="Times New Roman" w:cs="Times New Roman"/>
-          <w:b/>
-          <w:sz w:val="24"/>
-        </w:rPr>
-        <w:t>Kumo</w:t>
-      </w:r>
-      <w:r>
-        <w:rPr>
-          <w:rFonts w:ascii="Times New Roman" w:hAnsi="Times New Roman" w:cs="Times New Roman"/>
-          <w:b/>
-          <w:sz w:val="24"/>
-        </w:rPr>
-        <w:t xml:space="preserve">, </w:t>
-      </w:r>
-      <w:r>
-        <w:rPr>
-          <w:rFonts w:ascii="Times New Roman" w:hAnsi="Times New Roman" w:cs="Times New Roman"/>
-          <w:b/>
-          <w:sz w:val="24"/>
-        </w:rPr>
-        <w:t>Gombe</w:t>
-      </w:r>
-      <w:r>
-        <w:rPr>
-          <w:rFonts w:ascii="Times New Roman" w:hAnsi="Times New Roman" w:cs="Times New Roman"/>
-          <w:b/>
-          <w:sz w:val="24"/>
-        </w:rPr>
-        <w:t xml:space="preserve"> State</w:t>
-      </w:r>
-      <w:r>
-        <w:rPr>
-          <w:rFonts w:ascii="Times New Roman" w:hAnsi="Times New Roman" w:cs="Times New Roman"/>
-          <w:b/>
-          <w:sz w:val="24"/>
-        </w:rPr>
-        <w:t>.</w:t>
-      </w:r>
-    </w:p>
-    <w:p>
-      <w:pPr>
-        <w:pStyle w:val="ListParagraph"/>
-        <w:spacing w:line="480" w:lineRule="auto"/>
-        <w:rPr>
-          <w:rFonts w:ascii="Times New Roman" w:hAnsi="Times New Roman" w:cs="Times New Roman"/>
-          <w:sz w:val="24"/>
-        </w:rPr>
-      </w:pPr>
-      <w:r>
-        <w:rPr>
-          <w:rFonts w:ascii="Times New Roman" w:hAnsi="Times New Roman" w:cs="Times New Roman"/>
-          <w:sz w:val="24"/>
-        </w:rPr>
-        <w:t>However, you may have to report to other locations of LUC if the management requires you to do so.</w:t>
+        <w:t xml:space="preserve">Lincoln College of Science Management &amp; Technology Campus, </w:t>
+      </w:r>
+      <w:proofErr w:type="spellStart"/>
+      <w:r>
+        <w:rPr>
+          <w:rFonts w:ascii="Times New Roman" w:hAnsi="Times New Roman" w:cs="Times New Roman"/>
+          <w:b/>
+          <w:sz w:val="24"/>
+        </w:rPr>
+        <w:t>Azhata</w:t>
+      </w:r>
+      <w:proofErr w:type="spellEnd"/>
+      <w:r>
+        <w:rPr>
+          <w:rFonts w:ascii="Times New Roman" w:hAnsi="Times New Roman" w:cs="Times New Roman"/>
+          <w:b/>
+          <w:sz w:val="24"/>
+        </w:rPr>
+        <w:t xml:space="preserve">, along </w:t>
+      </w:r>
+      <w:proofErr w:type="spellStart"/>
+      <w:r>
+        <w:rPr>
+          <w:rFonts w:ascii="Times New Roman" w:hAnsi="Times New Roman" w:cs="Times New Roman"/>
+          <w:b/>
+          <w:sz w:val="24"/>
+        </w:rPr>
+        <w:t>Nyanya-Karshi</w:t>
+      </w:r>
+      <w:proofErr w:type="spellEnd"/>
+      <w:r>
+        <w:rPr>
+          <w:rFonts w:ascii="Times New Roman" w:hAnsi="Times New Roman" w:cs="Times New Roman"/>
+          <w:b/>
+          <w:sz w:val="24"/>
+        </w:rPr>
+        <w:t xml:space="preserve"> Road, FCT Abuja, Nigeria.</w:t>
       </w:r>
     </w:p>
     <w:p>
@@ -953,15 +866,7 @@
           <w:b/>
           <w:sz w:val="24"/>
         </w:rPr>
-        <w:t xml:space="preserve">Working Hours/Days: </w:t>
-      </w:r>
-      <w:r>
-        <w:rPr>
-          <w:rFonts w:ascii="Times New Roman" w:hAnsi="Times New Roman" w:cs="Times New Roman"/>
-          <w:b/>
-          <w:sz w:val="24"/>
-        </w:rPr>
-        <w:t>Monday – Friday (9am-5pm)</w:t>
+        <w:t>Working Hours/Days: Monday – Friday (9am-5pm)</w:t>
       </w:r>
     </w:p>
     <w:p>
@@ -1092,6 +997,7 @@
         <w:rPr>
           <w:rFonts w:ascii="Times New Roman" w:hAnsi="Times New Roman" w:cs="Times New Roman"/>
           <w:b/>
+          <w:dstrike/>
           <w:sz w:val="24"/>
         </w:rPr>
         <w:t xml:space="preserve"/>
@@ -1100,59 +1006,68 @@
         <w:rPr>
           <w:rFonts w:ascii="Times New Roman" w:hAnsi="Times New Roman" w:cs="Times New Roman"/>
           <w:b/>
+          <w:sz w:val="24"/>
+        </w:rPr>
+        <w:t xml:space="preserve"/>
+      </w:r>
+    </w:p>
+    <w:p>
+      <w:pPr>
+        <w:pStyle w:val="ListParagraph"/>
+        <w:spacing w:line="360" w:lineRule="auto"/>
+        <w:ind w:left="1440"/>
+        <w:rPr>
+          <w:rFonts w:ascii="Times New Roman" w:hAnsi="Times New Roman" w:cs="Times New Roman"/>
+          <w:b/>
+          <w:sz w:val="24"/>
+        </w:rPr>
+      </w:pPr>
+      <w:r>
+        <w:rPr>
+          <w:rFonts w:ascii="Times New Roman" w:hAnsi="Times New Roman" w:cs="Times New Roman"/>
+          <w:b/>
+          <w:bCs/>
+          <w:sz w:val="24"/>
+        </w:rPr>
+        <w:t xml:space="preserve">Net Salary (After Tax):</w:t>
+      </w:r>
+      <w:r>
+        <w:rPr>
+          <w:rFonts w:ascii="Times New Roman" w:hAnsi="Times New Roman" w:cs="Times New Roman"/>
+          <w:b/>
+          <w:sz w:val="24"/>
+        </w:rPr>
+        <w:t xml:space="preserve"> </w:t>
+      </w:r>
+      <w:r>
+        <w:rPr>
+          <w:rFonts w:ascii="Times New Roman" w:hAnsi="Times New Roman" w:cs="Times New Roman"/>
+          <w:b/>
           <w:dstrike/>
           <w:sz w:val="24"/>
         </w:rPr>
+        <w:t xml:space="preserve">${net_salary}</w:t>
+      </w:r>
+      <w:r>
+        <w:rPr>
+          <w:rFonts w:ascii="Times New Roman" w:hAnsi="Times New Roman" w:cs="Times New Roman"/>
+          <w:b/>
+          <w:sz w:val="24"/>
+        </w:rPr>
         <w:t xml:space="preserve"/>
       </w:r>
-      <w:r>
-        <w:rPr>
-          <w:rFonts w:ascii="Times New Roman" w:hAnsi="Times New Roman" w:cs="Times New Roman"/>
-          <w:b/>
-          <w:sz w:val="24"/>
-        </w:rPr>
-        <w:t xml:space="preserve"/>
-      </w:r>
-      <w:r>
-        <w:rPr>
-          <w:rFonts w:ascii="Times New Roman" w:hAnsi="Times New Roman" w:cs="Times New Roman"/>
-          <w:b/>
-          <w:sz w:val="24"/>
-        </w:rPr>
-        <w:t xml:space="preserve"/>
-      </w:r>
-      <w:r>
-        <w:rPr>
-          <w:rFonts w:ascii="Times New Roman" w:hAnsi="Times New Roman" w:cs="Times New Roman"/>
-          <w:b/>
-          <w:sz w:val="24"/>
-        </w:rPr>
-        <w:t xml:space="preserve"/>
-      </w:r>
-      <w:r>
-        <w:rPr>
-          <w:rFonts w:ascii="Times New Roman" w:hAnsi="Times New Roman" w:cs="Times New Roman"/>
-          <w:b/>
-          <w:sz w:val="24"/>
-        </w:rPr>
-        <w:t xml:space="preserve"/>
-      </w:r>
-      <w:r>
-        <w:rPr>
-          <w:rFonts w:ascii="Times New Roman" w:hAnsi="Times New Roman" w:cs="Times New Roman"/>
-          <w:b/>
-          <w:sz w:val="24"/>
-        </w:rPr>
-        <w:t xml:space="preserve"/>
-      </w:r>
-      <w:r>
-        <w:rPr>
-          <w:rFonts w:ascii="Times New Roman" w:hAnsi="Times New Roman" w:cs="Times New Roman"/>
-          <w:b/>
-          <w:sz w:val="24"/>
-        </w:rPr>
-        <w:t xml:space="preserve"/>
-      </w:r>
+    </w:p>
+    <w:p>
+      <w:pPr>
+        <w:pStyle w:val="ListParagraph"/>
+        <w:spacing w:line="360" w:lineRule="auto"/>
+        <w:ind w:left="1440"/>
+        <w:rPr>
+          <w:rFonts w:ascii="Times New Roman" w:hAnsi="Times New Roman" w:cs="Times New Roman"/>
+          <w:b/>
+          <w:sz w:val="24"/>
+        </w:rPr>
+      </w:pPr>
     </w:p>
     <w:p>
       <w:pPr>
@@ -1161,7 +1076,7 @@
           <w:ilvl w:val="2"/>
           <w:numId w:val="1"/>
         </w:numPr>
-        <w:spacing w:line="480" w:lineRule="auto"/>
+        <w:spacing w:line="360" w:lineRule="auto"/>
         <w:ind w:left="1440" w:hanging="540"/>
         <w:rPr>
           <w:rFonts w:ascii="Times New Roman" w:hAnsi="Times New Roman" w:cs="Times New Roman"/>
@@ -1198,288 +1113,256 @@
         <w:lastRenderedPageBreak/>
         <w:t xml:space="preserve">Duties: </w:t>
       </w:r>
-      <w:r>
-        <w:rPr>
-          <w:rFonts w:ascii="Times New Roman" w:hAnsi="Times New Roman" w:cs="Times New Roman"/>
-          <w:sz w:val="24"/>
-        </w:rPr>
-        <w:t xml:space="preserve">You will report to the </w:t>
-      </w:r>
-      <w:r>
-        <w:rPr>
-          <w:rFonts w:ascii="Times New Roman" w:hAnsi="Times New Roman" w:cs="Times New Roman"/>
-          <w:b/>
-          <w:sz w:val="24"/>
-        </w:rPr>
-        <w:t>HOD</w:t>
-      </w:r>
-      <w:r>
-        <w:rPr>
-          <w:rFonts w:ascii="Times New Roman" w:hAnsi="Times New Roman" w:cs="Times New Roman"/>
-          <w:sz w:val="24"/>
-        </w:rPr>
-        <w:t xml:space="preserve"> and/or their nominated person(s) for duties and responsibilities on the following:</w:t>
-      </w:r>
     </w:p>
     <w:p>
       <w:pPr>
         <w:pStyle w:val="ListParagraph"/>
         <w:numPr>
-          <w:ilvl w:val="2"/>
-          <w:numId w:val="1"/>
+          <w:ilvl w:val="0"/>
+          <w:numId w:val="4"/>
         </w:numPr>
-        <w:spacing w:line="360" w:lineRule="auto"/>
+        <w:spacing w:after="0" w:line="360" w:lineRule="auto"/>
         <w:ind w:left="1440" w:hanging="540"/>
         <w:rPr>
-          <w:rFonts w:ascii="Times New Roman" w:hAnsi="Times New Roman" w:cs="Times New Roman"/>
-          <w:sz w:val="24"/>
-        </w:rPr>
-      </w:pPr>
-      <w:r>
-        <w:rPr>
-          <w:rFonts w:ascii="Times New Roman" w:hAnsi="Times New Roman" w:cs="Times New Roman"/>
-          <w:sz w:val="24"/>
-        </w:rPr>
-        <w:t>To contribute in teaching, prepare examination question papers and marking papers, prepare Education Ministry documentation and any other relevant duties and responsibilities deemed needed by the undergraduate and postgraduate programmes.</w:t>
+          <w:rFonts w:ascii="Times New Roman" w:eastAsia="Times New Roman" w:hAnsi="Times New Roman" w:cs="Times New Roman"/>
+          <w:sz w:val="24"/>
+          <w:szCs w:val="24"/>
+        </w:rPr>
+      </w:pPr>
+      <w:r>
+        <w:rPr>
+          <w:rFonts w:ascii="Times New Roman" w:eastAsia="Times New Roman" w:hAnsi="Times New Roman" w:cs="Times New Roman"/>
+          <w:sz w:val="24"/>
+          <w:szCs w:val="24"/>
+        </w:rPr>
+        <w:t xml:space="preserve">Prepare and manage the institution’s budget and financial plans. </w:t>
       </w:r>
     </w:p>
     <w:p>
       <w:pPr>
         <w:pStyle w:val="ListParagraph"/>
         <w:numPr>
-          <w:ilvl w:val="2"/>
-          <w:numId w:val="1"/>
+          <w:ilvl w:val="0"/>
+          <w:numId w:val="4"/>
         </w:numPr>
-        <w:tabs>
-          <w:tab w:val="left" w:pos="1440"/>
-        </w:tabs>
-        <w:spacing w:line="360" w:lineRule="auto"/>
+        <w:spacing w:after="0" w:line="360" w:lineRule="auto"/>
         <w:ind w:left="1440" w:hanging="540"/>
         <w:rPr>
-          <w:rFonts w:ascii="Times New Roman" w:hAnsi="Times New Roman" w:cs="Times New Roman"/>
-          <w:sz w:val="24"/>
-        </w:rPr>
-      </w:pPr>
-      <w:r>
-        <w:rPr>
-          <w:rFonts w:ascii="Times New Roman" w:hAnsi="Times New Roman" w:cs="Times New Roman"/>
-          <w:sz w:val="24"/>
-          <w:lang w:val="en-MY"/>
-        </w:rPr>
-        <w:t>To participate in education counselling and marketing</w:t>
-      </w:r>
-      <w:r>
-        <w:rPr>
-          <w:rFonts w:ascii="Times New Roman" w:hAnsi="Times New Roman" w:cs="Times New Roman"/>
-          <w:sz w:val="24"/>
-          <w:lang w:val="en-MY"/>
-        </w:rPr>
-        <w:t xml:space="preserve"> activities.</w:t>
+          <w:rFonts w:ascii="Times New Roman" w:eastAsia="Times New Roman" w:hAnsi="Times New Roman" w:cs="Times New Roman"/>
+          <w:sz w:val="24"/>
+          <w:szCs w:val="24"/>
+        </w:rPr>
+      </w:pPr>
+      <w:r>
+        <w:rPr>
+          <w:rFonts w:ascii="Times New Roman" w:eastAsia="Times New Roman" w:hAnsi="Times New Roman" w:cs="Times New Roman"/>
+          <w:sz w:val="24"/>
+          <w:szCs w:val="24"/>
+        </w:rPr>
+        <w:t xml:space="preserve">Maintain accurate records of all financial transactions and ensure proper documentation. </w:t>
       </w:r>
     </w:p>
     <w:p>
       <w:pPr>
         <w:pStyle w:val="ListParagraph"/>
         <w:numPr>
-          <w:ilvl w:val="2"/>
-          <w:numId w:val="1"/>
+          <w:ilvl w:val="0"/>
+          <w:numId w:val="4"/>
         </w:numPr>
-        <w:tabs>
-          <w:tab w:val="left" w:pos="1440"/>
-        </w:tabs>
-        <w:spacing w:line="360" w:lineRule="auto"/>
+        <w:spacing w:after="0" w:line="360" w:lineRule="auto"/>
         <w:ind w:left="1440" w:hanging="540"/>
         <w:rPr>
-          <w:rFonts w:ascii="Times New Roman" w:hAnsi="Times New Roman" w:cs="Times New Roman"/>
-          <w:sz w:val="24"/>
-        </w:rPr>
-      </w:pPr>
-      <w:r>
-        <w:rPr>
-          <w:rFonts w:ascii="Times New Roman" w:hAnsi="Times New Roman" w:cs="Times New Roman"/>
-          <w:sz w:val="24"/>
-          <w:lang w:val="en-MY"/>
-        </w:rPr>
-        <w:t xml:space="preserve">Maintaining student records online that include their registration details, accommodation and other report as necessary.  </w:t>
+          <w:rFonts w:ascii="Times New Roman" w:eastAsia="Times New Roman" w:hAnsi="Times New Roman" w:cs="Times New Roman"/>
+          <w:sz w:val="24"/>
+          <w:szCs w:val="24"/>
+        </w:rPr>
+      </w:pPr>
+      <w:r>
+        <w:rPr>
+          <w:rFonts w:ascii="Times New Roman" w:eastAsia="Times New Roman" w:hAnsi="Times New Roman" w:cs="Times New Roman"/>
+          <w:sz w:val="24"/>
+          <w:szCs w:val="24"/>
+        </w:rPr>
+        <w:t xml:space="preserve">Monitor daily income and expenditure to ensure effective cash flow management. </w:t>
       </w:r>
     </w:p>
     <w:p>
       <w:pPr>
         <w:pStyle w:val="ListParagraph"/>
         <w:numPr>
-          <w:ilvl w:val="2"/>
-          <w:numId w:val="1"/>
+          <w:ilvl w:val="0"/>
+          <w:numId w:val="4"/>
         </w:numPr>
-        <w:tabs>
-          <w:tab w:val="left" w:pos="1440"/>
-        </w:tabs>
-        <w:spacing w:line="360" w:lineRule="auto"/>
+        <w:spacing w:after="0" w:line="360" w:lineRule="auto"/>
         <w:ind w:left="1440" w:hanging="540"/>
         <w:rPr>
-          <w:rFonts w:ascii="Times New Roman" w:hAnsi="Times New Roman" w:cs="Times New Roman"/>
-          <w:sz w:val="24"/>
-        </w:rPr>
-      </w:pPr>
-      <w:r>
-        <w:rPr>
-          <w:rFonts w:ascii="Times New Roman" w:hAnsi="Times New Roman" w:cs="Times New Roman"/>
-          <w:sz w:val="24"/>
-          <w:lang w:val="en-MY"/>
-        </w:rPr>
-        <w:t>To be involved in the curriculum development</w:t>
-      </w:r>
-      <w:r>
-        <w:rPr>
-          <w:rFonts w:ascii="Times New Roman" w:hAnsi="Times New Roman" w:cs="Times New Roman"/>
-          <w:sz w:val="24"/>
-          <w:lang w:val="en-MY"/>
-        </w:rPr>
-        <w:t>.</w:t>
+          <w:rFonts w:ascii="Times New Roman" w:eastAsia="Times New Roman" w:hAnsi="Times New Roman" w:cs="Times New Roman"/>
+          <w:sz w:val="24"/>
+          <w:szCs w:val="24"/>
+        </w:rPr>
+      </w:pPr>
+      <w:r>
+        <w:rPr>
+          <w:rFonts w:ascii="Times New Roman" w:eastAsia="Times New Roman" w:hAnsi="Times New Roman" w:cs="Times New Roman"/>
+          <w:sz w:val="24"/>
+          <w:szCs w:val="24"/>
+        </w:rPr>
+        <w:t xml:space="preserve">Prepare monthly, quarterly, and annual financial reports for management review. </w:t>
       </w:r>
     </w:p>
     <w:p>
       <w:pPr>
         <w:pStyle w:val="ListParagraph"/>
         <w:numPr>
-          <w:ilvl w:val="2"/>
-          <w:numId w:val="1"/>
+          <w:ilvl w:val="0"/>
+          <w:numId w:val="4"/>
         </w:numPr>
-        <w:tabs>
-          <w:tab w:val="left" w:pos="1440"/>
-        </w:tabs>
-        <w:spacing w:line="360" w:lineRule="auto"/>
+        <w:spacing w:after="0" w:line="360" w:lineRule="auto"/>
         <w:ind w:left="1440" w:hanging="540"/>
         <w:rPr>
-          <w:rFonts w:ascii="Times New Roman" w:hAnsi="Times New Roman" w:cs="Times New Roman"/>
-          <w:sz w:val="24"/>
-        </w:rPr>
-      </w:pPr>
-      <w:r>
-        <w:rPr>
-          <w:rFonts w:ascii="Times New Roman" w:hAnsi="Times New Roman" w:cs="Times New Roman"/>
-          <w:sz w:val="24"/>
-          <w:lang w:val="en-MY"/>
-        </w:rPr>
-        <w:t>To work as a team on scholarships and other events, when necessary, that can promote the objectives, vision and mission of Lincoln University</w:t>
-      </w:r>
-      <w:r>
-        <w:rPr>
-          <w:rFonts w:ascii="Times New Roman" w:hAnsi="Times New Roman" w:cs="Times New Roman"/>
-          <w:sz w:val="24"/>
-          <w:lang w:val="en-MY"/>
-        </w:rPr>
-        <w:t>.</w:t>
+          <w:rFonts w:ascii="Times New Roman" w:eastAsia="Times New Roman" w:hAnsi="Times New Roman" w:cs="Times New Roman"/>
+          <w:sz w:val="24"/>
+          <w:szCs w:val="24"/>
+        </w:rPr>
+      </w:pPr>
+      <w:r>
+        <w:rPr>
+          <w:rFonts w:ascii="Times New Roman" w:eastAsia="Times New Roman" w:hAnsi="Times New Roman" w:cs="Times New Roman"/>
+          <w:sz w:val="24"/>
+          <w:szCs w:val="24"/>
+        </w:rPr>
+        <w:t xml:space="preserve">Supervise the collection of fees, revenues, and other institutional payments. </w:t>
       </w:r>
     </w:p>
     <w:p>
       <w:pPr>
         <w:pStyle w:val="ListParagraph"/>
         <w:numPr>
-          <w:ilvl w:val="2"/>
-          <w:numId w:val="1"/>
+          <w:ilvl w:val="0"/>
+          <w:numId w:val="4"/>
         </w:numPr>
-        <w:tabs>
-          <w:tab w:val="left" w:pos="1440"/>
-        </w:tabs>
-        <w:spacing w:line="360" w:lineRule="auto"/>
+        <w:spacing w:after="0" w:line="360" w:lineRule="auto"/>
         <w:ind w:left="1440" w:hanging="540"/>
         <w:rPr>
-          <w:rFonts w:ascii="Times New Roman" w:hAnsi="Times New Roman" w:cs="Times New Roman"/>
-          <w:sz w:val="24"/>
-        </w:rPr>
-      </w:pPr>
-      <w:r>
-        <w:rPr>
-          <w:rFonts w:ascii="Times New Roman" w:hAnsi="Times New Roman" w:cs="Times New Roman"/>
-          <w:sz w:val="24"/>
-          <w:lang w:val="en-MY"/>
-        </w:rPr>
-        <w:t>To carry out significant research and publish in reputable international journals</w:t>
-      </w:r>
-      <w:r>
-        <w:rPr>
-          <w:rFonts w:ascii="Times New Roman" w:hAnsi="Times New Roman" w:cs="Times New Roman"/>
-          <w:sz w:val="24"/>
-          <w:lang w:val="en-MY"/>
-        </w:rPr>
-        <w:t>.</w:t>
+          <w:rFonts w:ascii="Times New Roman" w:eastAsia="Times New Roman" w:hAnsi="Times New Roman" w:cs="Times New Roman"/>
+          <w:sz w:val="24"/>
+          <w:szCs w:val="24"/>
+        </w:rPr>
+      </w:pPr>
+      <w:r>
+        <w:rPr>
+          <w:rFonts w:ascii="Times New Roman" w:eastAsia="Times New Roman" w:hAnsi="Times New Roman" w:cs="Times New Roman"/>
+          <w:sz w:val="24"/>
+          <w:szCs w:val="24"/>
+        </w:rPr>
+        <w:t xml:space="preserve">Process payments for vendors, contractors, and other financial obligations of the institution. </w:t>
       </w:r>
     </w:p>
     <w:p>
       <w:pPr>
         <w:pStyle w:val="ListParagraph"/>
         <w:numPr>
-          <w:ilvl w:val="2"/>
-          <w:numId w:val="1"/>
+          <w:ilvl w:val="0"/>
+          <w:numId w:val="4"/>
         </w:numPr>
-        <w:tabs>
-          <w:tab w:val="left" w:pos="1440"/>
-        </w:tabs>
-        <w:spacing w:line="360" w:lineRule="auto"/>
+        <w:spacing w:after="0" w:line="360" w:lineRule="auto"/>
         <w:ind w:left="1440" w:hanging="540"/>
         <w:rPr>
-          <w:rFonts w:ascii="Times New Roman" w:hAnsi="Times New Roman" w:cs="Times New Roman"/>
-          <w:sz w:val="24"/>
-        </w:rPr>
-      </w:pPr>
-      <w:r>
-        <w:rPr>
-          <w:rFonts w:ascii="Times New Roman" w:hAnsi="Times New Roman" w:cs="Times New Roman"/>
-          <w:sz w:val="24"/>
-          <w:lang w:val="en-MY"/>
-        </w:rPr>
-        <w:t>To design and implement projects presented by Lincoln University</w:t>
-      </w:r>
-      <w:r>
-        <w:rPr>
-          <w:rFonts w:ascii="Times New Roman" w:hAnsi="Times New Roman" w:cs="Times New Roman"/>
-          <w:sz w:val="24"/>
-          <w:lang w:val="en-MY"/>
-        </w:rPr>
-        <w:t>.</w:t>
+          <w:rFonts w:ascii="Times New Roman" w:eastAsia="Times New Roman" w:hAnsi="Times New Roman" w:cs="Times New Roman"/>
+          <w:sz w:val="24"/>
+          <w:szCs w:val="24"/>
+        </w:rPr>
+      </w:pPr>
+      <w:r>
+        <w:rPr>
+          <w:rFonts w:ascii="Times New Roman" w:eastAsia="Times New Roman" w:hAnsi="Times New Roman" w:cs="Times New Roman"/>
+          <w:sz w:val="24"/>
+          <w:szCs w:val="24"/>
+        </w:rPr>
+        <w:t xml:space="preserve">Ensure compliance with financial policies, procedures, and statutory regulations. </w:t>
       </w:r>
     </w:p>
     <w:p>
       <w:pPr>
         <w:pStyle w:val="ListParagraph"/>
         <w:numPr>
-          <w:ilvl w:val="2"/>
-          <w:numId w:val="1"/>
+          <w:ilvl w:val="0"/>
+          <w:numId w:val="4"/>
         </w:numPr>
-        <w:tabs>
-          <w:tab w:val="left" w:pos="1440"/>
-        </w:tabs>
-        <w:spacing w:line="360" w:lineRule="auto"/>
+        <w:spacing w:after="0" w:line="360" w:lineRule="auto"/>
         <w:ind w:left="1440" w:hanging="540"/>
         <w:rPr>
-          <w:rFonts w:ascii="Times New Roman" w:hAnsi="Times New Roman" w:cs="Times New Roman"/>
-          <w:sz w:val="24"/>
-        </w:rPr>
-      </w:pPr>
-      <w:r>
-        <w:rPr>
-          <w:rFonts w:ascii="Times New Roman" w:hAnsi="Times New Roman" w:cs="Times New Roman"/>
-          <w:sz w:val="24"/>
-          <w:lang w:val="en-MY"/>
-        </w:rPr>
-        <w:t>Other duties as instructed by the Department Coordinator</w:t>
-      </w:r>
-      <w:r>
-        <w:rPr>
-          <w:rFonts w:ascii="Times New Roman" w:hAnsi="Times New Roman" w:cs="Times New Roman"/>
-          <w:sz w:val="24"/>
-          <w:lang w:val="en-MY"/>
-        </w:rPr>
-        <w:t>.</w:t>
-      </w:r>
-    </w:p>
-    <w:p>
-      <w:pPr>
-        <w:pStyle w:val="ListParagraph"/>
-        <w:tabs>
-          <w:tab w:val="left" w:pos="1440"/>
-        </w:tabs>
-        <w:spacing w:line="360" w:lineRule="auto"/>
+          <w:rFonts w:ascii="Times New Roman" w:eastAsia="Times New Roman" w:hAnsi="Times New Roman" w:cs="Times New Roman"/>
+          <w:sz w:val="24"/>
+          <w:szCs w:val="24"/>
+        </w:rPr>
+      </w:pPr>
+      <w:r>
+        <w:rPr>
+          <w:rFonts w:ascii="Times New Roman" w:eastAsia="Times New Roman" w:hAnsi="Times New Roman" w:cs="Times New Roman"/>
+          <w:sz w:val="24"/>
+          <w:szCs w:val="24"/>
+        </w:rPr>
+        <w:t xml:space="preserve">Coordinate internal and external audits and provide all required financial records. </w:t>
+      </w:r>
+    </w:p>
+    <w:p>
+      <w:pPr>
+        <w:pStyle w:val="ListParagraph"/>
+        <w:numPr>
+          <w:ilvl w:val="0"/>
+          <w:numId w:val="4"/>
+        </w:numPr>
+        <w:spacing w:after="0" w:line="360" w:lineRule="auto"/>
+        <w:ind w:left="1440" w:hanging="540"/>
+        <w:rPr>
+          <w:rFonts w:ascii="Times New Roman" w:eastAsia="Times New Roman" w:hAnsi="Times New Roman" w:cs="Times New Roman"/>
+          <w:sz w:val="24"/>
+          <w:szCs w:val="24"/>
+        </w:rPr>
+      </w:pPr>
+      <w:r>
+        <w:rPr>
+          <w:rFonts w:ascii="Times New Roman" w:eastAsia="Times New Roman" w:hAnsi="Times New Roman" w:cs="Times New Roman"/>
+          <w:sz w:val="24"/>
+          <w:szCs w:val="24"/>
+        </w:rPr>
+        <w:t xml:space="preserve">Monitor bank transactions and reconcile financial statements regularly. </w:t>
+      </w:r>
+    </w:p>
+    <w:p>
+      <w:pPr>
+        <w:pStyle w:val="ListParagraph"/>
+        <w:numPr>
+          <w:ilvl w:val="0"/>
+          <w:numId w:val="4"/>
+        </w:numPr>
+        <w:tabs>
+          <w:tab w:val="left" w:pos="1440"/>
+        </w:tabs>
+        <w:spacing w:line="480" w:lineRule="auto"/>
+        <w:ind w:left="1440" w:hanging="540"/>
+        <w:rPr>
+          <w:rFonts w:ascii="Times New Roman" w:hAnsi="Times New Roman" w:cs="Times New Roman"/>
+          <w:sz w:val="24"/>
+        </w:rPr>
+      </w:pPr>
+      <w:r>
+        <w:rPr>
+          <w:rFonts w:ascii="Times New Roman" w:eastAsia="Times New Roman" w:hAnsi="Times New Roman" w:cs="Times New Roman"/>
+          <w:sz w:val="24"/>
+          <w:szCs w:val="24"/>
+        </w:rPr>
+        <w:t>Perform any other financial or administrative duties as may be assigned by Management.</w:t>
+      </w:r>
+    </w:p>
+    <w:p>
+      <w:pPr>
+        <w:pStyle w:val="ListParagraph"/>
+        <w:tabs>
+          <w:tab w:val="left" w:pos="1440"/>
+        </w:tabs>
+        <w:spacing w:line="480" w:lineRule="auto"/>
         <w:ind w:left="1440"/>
         <w:rPr>
           <w:rFonts w:ascii="Times New Roman" w:hAnsi="Times New Roman" w:cs="Times New Roman"/>
@@ -1500,35 +1383,31 @@
         <w:spacing w:line="360" w:lineRule="auto"/>
         <w:rPr>
           <w:rFonts w:ascii="Times New Roman" w:hAnsi="Times New Roman" w:cs="Times New Roman"/>
-          <w:b/>
-          <w:sz w:val="24"/>
-        </w:rPr>
-      </w:pPr>
-      <w:r>
-        <w:rPr>
-          <w:rFonts w:ascii="Times New Roman" w:hAnsi="Times New Roman" w:cs="Times New Roman"/>
-          <w:b/>
-          <w:sz w:val="24"/>
-          <w:lang w:val="en-MY"/>
-        </w:rPr>
-        <w:t>Recruitment:</w:t>
-      </w:r>
-      <w:r>
-        <w:rPr>
-          <w:rFonts w:ascii="Times New Roman" w:hAnsi="Times New Roman" w:cs="Times New Roman"/>
-          <w:b/>
-          <w:sz w:val="24"/>
-          <w:lang w:val="en-MY"/>
-        </w:rPr>
-        <w:t xml:space="preserve"> </w:t>
-      </w:r>
-      <w:r>
-        <w:rPr>
-          <w:rFonts w:ascii="Times New Roman" w:hAnsi="Times New Roman" w:cs="Times New Roman"/>
-          <w:sz w:val="24"/>
-          <w:lang w:val="en-MY"/>
-        </w:rPr>
-        <w:t>Every staff should participate in student recruitment exercise.</w:t>
+          <w:sz w:val="24"/>
+        </w:rPr>
+      </w:pPr>
+      <w:r>
+        <w:rPr>
+          <w:rFonts w:ascii="Times New Roman" w:hAnsi="Times New Roman" w:cs="Times New Roman"/>
+          <w:b/>
+          <w:sz w:val="24"/>
+          <w:lang w:val="en-MY"/>
+        </w:rPr>
+        <w:t xml:space="preserve">Recruitment: </w:t>
+      </w:r>
+      <w:r>
+        <w:rPr>
+          <w:rFonts w:ascii="Times New Roman" w:hAnsi="Times New Roman" w:cs="Times New Roman"/>
+          <w:sz w:val="24"/>
+        </w:rPr>
+        <w:t>All staff members are required to actively participate in student recruitment exercises. Participation shall entitle the staff member to a commission, as determ</w:t>
+      </w:r>
+      <w:r>
+        <w:rPr>
+          <w:rFonts w:ascii="Times New Roman" w:hAnsi="Times New Roman" w:cs="Times New Roman"/>
+          <w:sz w:val="24"/>
+        </w:rPr>
+        <w:t>ined and fixed by the Management.</w:t>
       </w:r>
     </w:p>
     <w:p>
@@ -1562,14 +1441,7 @@
           <w:rFonts w:ascii="Times New Roman" w:hAnsi="Times New Roman" w:cs="Times New Roman"/>
           <w:sz w:val="24"/>
         </w:rPr>
-        <w:t xml:space="preserve"> </w:t>
-      </w:r>
-      <w:r>
-        <w:rPr>
-          <w:rFonts w:ascii="Times New Roman" w:hAnsi="Times New Roman" w:cs="Times New Roman"/>
-          <w:sz w:val="24"/>
-        </w:rPr>
-        <w:t>90 days (Probation period is included in the contract duration). The probation period shall be reduced or extended at the sole discretion of the Management depending on your performance, conduct and discipline</w:t>
+        <w:t xml:space="preserve"> 90 days (Probation period is included in the contract duration). The probation period shall be reduced or extended at the sole discretion of the Management depending on your performance, conduct and discipline</w:t>
       </w:r>
     </w:p>
     <w:p>
@@ -1701,10 +1573,24 @@
         <w:t xml:space="preserve">The period of notice shall be as follows </w:t>
       </w:r>
     </w:p>
+    <w:p>
+      <w:pPr>
+        <w:pStyle w:val="ListParagraph"/>
+        <w:tabs>
+          <w:tab w:val="left" w:pos="1440"/>
+        </w:tabs>
+        <w:spacing w:line="360" w:lineRule="auto"/>
+        <w:rPr>
+          <w:rFonts w:ascii="Times New Roman" w:hAnsi="Times New Roman" w:cs="Times New Roman"/>
+          <w:b/>
+          <w:sz w:val="24"/>
+        </w:rPr>
+      </w:pPr>
+    </w:p>
     <w:tbl>
       <w:tblPr>
         <w:tblStyle w:val="TableGrid"/>
-        <w:tblpPr w:leftFromText="180" w:rightFromText="180" w:vertAnchor="text" w:horzAnchor="margin" w:tblpXSpec="center" w:tblpY="95"/>
+        <w:tblpPr w:leftFromText="180" w:rightFromText="180" w:vertAnchor="text" w:horzAnchor="page" w:tblpX="2908" w:tblpYSpec="inside"/>
         <w:tblW w:w="0" w:type="auto"/>
         <w:tblLook w:val="04A0" w:firstRow="1" w:lastRow="0" w:firstColumn="1" w:lastColumn="0" w:noHBand="0" w:noVBand="1"/>
       </w:tblPr>
@@ -1771,9 +1657,6 @@
         </w:tc>
       </w:tr>
       <w:tr>
-        <w:trPr>
-          <w:trHeight w:val="647"/>
-        </w:trPr>
         <w:tc>
           <w:tcPr>
             <w:tcW w:w="3600" w:type="dxa"/>
@@ -1784,6 +1667,7 @@
               <w:tabs>
                 <w:tab w:val="left" w:pos="1440"/>
               </w:tabs>
+              <w:spacing w:line="360" w:lineRule="auto"/>
               <w:ind w:left="0"/>
               <w:rPr>
                 <w:rFonts w:ascii="Times New Roman" w:hAnsi="Times New Roman" w:cs="Times New Roman"/>
@@ -1809,6 +1693,7 @@
               <w:tabs>
                 <w:tab w:val="left" w:pos="1440"/>
               </w:tabs>
+              <w:spacing w:line="360" w:lineRule="auto"/>
               <w:ind w:left="0"/>
               <w:rPr>
                 <w:rFonts w:ascii="Times New Roman" w:hAnsi="Times New Roman" w:cs="Times New Roman"/>
@@ -1820,7 +1705,14 @@
                 <w:rFonts w:ascii="Times New Roman" w:hAnsi="Times New Roman" w:cs="Times New Roman"/>
                 <w:sz w:val="24"/>
               </w:rPr>
-              <w:t xml:space="preserve">60 days or 60 days salary in lieu of notice </w:t>
+              <w:t>90 days or 9</w:t>
+            </w:r>
+            <w:r>
+              <w:rPr>
+                <w:rFonts w:ascii="Times New Roman" w:hAnsi="Times New Roman" w:cs="Times New Roman"/>
+                <w:sz w:val="24"/>
+              </w:rPr>
+              <w:t xml:space="preserve">0 days salary in lieu of notice </w:t>
             </w:r>
           </w:p>
         </w:tc>
@@ -1864,7 +1756,7 @@
         <w:rPr>
           <w:rFonts w:ascii="Times New Roman" w:hAnsi="Times New Roman" w:cs="Times New Roman"/>
           <w:b/>
-          <w:sz w:val="24"/>
+          <w:sz w:val="32"/>
         </w:rPr>
       </w:pPr>
     </w:p>
@@ -1887,65 +1779,448 @@
           <w:sz w:val="24"/>
           <w:szCs w:val="20"/>
         </w:rPr>
-        <w:t>Your employment may be terminated without notice or payment in lieu of notice, in the event that of any serious or repeated breach or non- observance by you of any of your express and/or implied terms and conditions of employment and/or if you committed a misconduct in connection with or affecting the business of the University</w:t>
-      </w:r>
-      <w:r>
-        <w:rPr>
-          <w:rFonts w:ascii="Times New Roman" w:eastAsia="Arial" w:hAnsi="Times New Roman" w:cs="Times New Roman"/>
-          <w:sz w:val="24"/>
-          <w:szCs w:val="20"/>
-        </w:rPr>
-        <w:t>.</w:t>
-      </w:r>
-    </w:p>
-    <w:p>
-      <w:pPr>
-        <w:pStyle w:val="ListParagraph"/>
+        <w:t>Your employment may be terminated without notice or payment in lieu of notice, in the event that of any serious or repeated breach or non- observance by you of any of your express and/or implied terms and conditions of employment and/or if you committed a misconduct in connection with or affecting the business of the College</w:t>
+      </w:r>
+    </w:p>
+    <w:p>
+      <w:pPr>
+        <w:pStyle w:val="ListParagraph"/>
+        <w:widowControl w:val="0"/>
         <w:numPr>
           <w:ilvl w:val="0"/>
-          <w:numId w:val="6"/>
+          <w:numId w:val="3"/>
         </w:numPr>
-        <w:tabs>
-          <w:tab w:val="left" w:pos="1440"/>
-        </w:tabs>
-        <w:spacing w:line="360" w:lineRule="auto"/>
-        <w:rPr>
-          <w:rFonts w:ascii="Times New Roman" w:hAnsi="Times New Roman" w:cs="Times New Roman"/>
-          <w:sz w:val="24"/>
-        </w:rPr>
-      </w:pPr>
-      <w:r>
-        <w:rPr>
-          <w:rFonts w:ascii="Times New Roman" w:hAnsi="Times New Roman" w:cs="Times New Roman"/>
-          <w:sz w:val="24"/>
-        </w:rPr>
-        <w:t>Resignation letter must be submitted before the stipulated 90 days’ notice period or payment of Three (3) month’s salary in lieu of notice.</w:t>
-      </w:r>
-    </w:p>
-    <w:p>
-      <w:pPr>
-        <w:pStyle w:val="ListParagraph"/>
+        <w:autoSpaceDE w:val="0"/>
+        <w:autoSpaceDN w:val="0"/>
+        <w:spacing w:after="0" w:line="360" w:lineRule="auto"/>
+        <w:ind w:left="1350" w:right="812"/>
+        <w:contextualSpacing w:val="0"/>
+        <w:rPr>
+          <w:rFonts w:ascii="Times New Roman" w:hAnsi="Times New Roman" w:cs="Times New Roman"/>
+          <w:sz w:val="24"/>
+          <w:szCs w:val="24"/>
+        </w:rPr>
+      </w:pPr>
+      <w:r>
+        <w:rPr>
+          <w:rFonts w:ascii="Times New Roman" w:hAnsi="Times New Roman" w:cs="Times New Roman"/>
+          <w:sz w:val="24"/>
+          <w:szCs w:val="24"/>
+        </w:rPr>
+        <w:lastRenderedPageBreak/>
+        <w:t xml:space="preserve">Administrative </w:t>
+      </w:r>
+      <w:proofErr w:type="gramStart"/>
+      <w:r>
+        <w:rPr>
+          <w:rFonts w:ascii="Times New Roman" w:hAnsi="Times New Roman" w:cs="Times New Roman"/>
+          <w:sz w:val="24"/>
+          <w:szCs w:val="24"/>
+        </w:rPr>
+        <w:t>staff are</w:t>
+      </w:r>
+      <w:proofErr w:type="gramEnd"/>
+      <w:r>
+        <w:rPr>
+          <w:rFonts w:ascii="Times New Roman" w:hAnsi="Times New Roman" w:cs="Times New Roman"/>
+          <w:sz w:val="24"/>
+          <w:szCs w:val="24"/>
+        </w:rPr>
+        <w:t xml:space="preserve"> required to give a minimum of thirty (30) days’ written notice of resignation.</w:t>
+      </w:r>
+    </w:p>
+    <w:p>
+      <w:pPr>
+        <w:pStyle w:val="ListParagraph"/>
+        <w:widowControl w:val="0"/>
         <w:numPr>
           <w:ilvl w:val="0"/>
-          <w:numId w:val="6"/>
+          <w:numId w:val="3"/>
         </w:numPr>
-        <w:tabs>
-          <w:tab w:val="left" w:pos="1440"/>
-        </w:tabs>
-        <w:spacing w:line="360" w:lineRule="auto"/>
-        <w:rPr>
-          <w:rFonts w:ascii="Times New Roman" w:hAnsi="Times New Roman" w:cs="Times New Roman"/>
-          <w:sz w:val="24"/>
-        </w:rPr>
-      </w:pPr>
-      <w:r>
-        <w:rPr>
-          <w:rFonts w:ascii="Times New Roman" w:hAnsi="Times New Roman" w:cs="Times New Roman"/>
-          <w:sz w:val="24"/>
-        </w:rPr>
-        <w:lastRenderedPageBreak/>
-        <w:t>Resignation will not be accepted until the end of semester and or final examination of module or completion of LUC R&amp;D projects.</w:t>
-      </w:r>
+        <w:autoSpaceDE w:val="0"/>
+        <w:autoSpaceDN w:val="0"/>
+        <w:spacing w:after="0" w:line="360" w:lineRule="auto"/>
+        <w:ind w:left="1350" w:right="812"/>
+        <w:contextualSpacing w:val="0"/>
+        <w:rPr>
+          <w:rFonts w:ascii="Times New Roman" w:hAnsi="Times New Roman" w:cs="Times New Roman"/>
+          <w:sz w:val="24"/>
+          <w:szCs w:val="24"/>
+        </w:rPr>
+      </w:pPr>
+      <w:r>
+        <w:rPr>
+          <w:rFonts w:ascii="Times New Roman" w:hAnsi="Times New Roman" w:cs="Times New Roman"/>
+          <w:sz w:val="24"/>
+          <w:szCs w:val="24"/>
+        </w:rPr>
+        <w:t xml:space="preserve">Academic </w:t>
+      </w:r>
+      <w:proofErr w:type="gramStart"/>
+      <w:r>
+        <w:rPr>
+          <w:rFonts w:ascii="Times New Roman" w:hAnsi="Times New Roman" w:cs="Times New Roman"/>
+          <w:sz w:val="24"/>
+          <w:szCs w:val="24"/>
+        </w:rPr>
+        <w:t>staff are</w:t>
+      </w:r>
+      <w:proofErr w:type="gramEnd"/>
+      <w:r>
+        <w:rPr>
+          <w:rFonts w:ascii="Times New Roman" w:hAnsi="Times New Roman" w:cs="Times New Roman"/>
+          <w:sz w:val="24"/>
+          <w:szCs w:val="24"/>
+        </w:rPr>
+        <w:t xml:space="preserve"> required to give a minimum of ninety (90) days’ written notice of resignation.</w:t>
+      </w:r>
+    </w:p>
+    <w:p>
+      <w:pPr>
+        <w:pStyle w:val="ListParagraph"/>
+        <w:widowControl w:val="0"/>
+        <w:numPr>
+          <w:ilvl w:val="0"/>
+          <w:numId w:val="3"/>
+        </w:numPr>
+        <w:autoSpaceDE w:val="0"/>
+        <w:autoSpaceDN w:val="0"/>
+        <w:spacing w:after="0" w:line="360" w:lineRule="auto"/>
+        <w:ind w:left="1350" w:right="812"/>
+        <w:contextualSpacing w:val="0"/>
+        <w:rPr>
+          <w:rFonts w:ascii="Times New Roman" w:hAnsi="Times New Roman" w:cs="Times New Roman"/>
+          <w:sz w:val="24"/>
+          <w:szCs w:val="24"/>
+        </w:rPr>
+      </w:pPr>
+      <w:r>
+        <w:rPr>
+          <w:rFonts w:ascii="Times New Roman" w:hAnsi="Times New Roman" w:cs="Times New Roman"/>
+          <w:sz w:val="24"/>
+          <w:szCs w:val="24"/>
+        </w:rPr>
+        <w:t>All employees must ensure proper completion of assigned duties and a formal handover process prior to exit</w:t>
+      </w:r>
+    </w:p>
+    <w:p>
+      <w:pPr>
+        <w:pStyle w:val="ListParagraph"/>
+        <w:widowControl w:val="0"/>
+        <w:numPr>
+          <w:ilvl w:val="0"/>
+          <w:numId w:val="3"/>
+        </w:numPr>
+        <w:autoSpaceDE w:val="0"/>
+        <w:autoSpaceDN w:val="0"/>
+        <w:spacing w:after="0" w:line="360" w:lineRule="auto"/>
+        <w:ind w:left="1350" w:right="812"/>
+        <w:contextualSpacing w:val="0"/>
+        <w:rPr>
+          <w:rFonts w:ascii="Times New Roman" w:hAnsi="Times New Roman" w:cs="Times New Roman"/>
+          <w:sz w:val="24"/>
+          <w:szCs w:val="24"/>
+        </w:rPr>
+      </w:pPr>
+      <w:r>
+        <w:rPr>
+          <w:rFonts w:ascii="Times New Roman" w:hAnsi="Times New Roman" w:cs="Times New Roman"/>
+          <w:sz w:val="24"/>
+          <w:szCs w:val="24"/>
+        </w:rPr>
+        <w:t>Resignation</w:t>
+      </w:r>
+      <w:r>
+        <w:rPr>
+          <w:rFonts w:ascii="Times New Roman" w:hAnsi="Times New Roman" w:cs="Times New Roman"/>
+          <w:spacing w:val="-3"/>
+          <w:sz w:val="24"/>
+          <w:szCs w:val="24"/>
+        </w:rPr>
+        <w:t xml:space="preserve"> </w:t>
+      </w:r>
+      <w:r>
+        <w:rPr>
+          <w:rFonts w:ascii="Times New Roman" w:hAnsi="Times New Roman" w:cs="Times New Roman"/>
+          <w:sz w:val="24"/>
+          <w:szCs w:val="24"/>
+        </w:rPr>
+        <w:t>will</w:t>
+      </w:r>
+      <w:r>
+        <w:rPr>
+          <w:rFonts w:ascii="Times New Roman" w:hAnsi="Times New Roman" w:cs="Times New Roman"/>
+          <w:spacing w:val="-3"/>
+          <w:sz w:val="24"/>
+          <w:szCs w:val="24"/>
+        </w:rPr>
+        <w:t xml:space="preserve"> </w:t>
+      </w:r>
+      <w:r>
+        <w:rPr>
+          <w:rFonts w:ascii="Times New Roman" w:hAnsi="Times New Roman" w:cs="Times New Roman"/>
+          <w:sz w:val="24"/>
+          <w:szCs w:val="24"/>
+        </w:rPr>
+        <w:t>not</w:t>
+      </w:r>
+      <w:r>
+        <w:rPr>
+          <w:rFonts w:ascii="Times New Roman" w:hAnsi="Times New Roman" w:cs="Times New Roman"/>
+          <w:spacing w:val="-3"/>
+          <w:sz w:val="24"/>
+          <w:szCs w:val="24"/>
+        </w:rPr>
+        <w:t xml:space="preserve"> </w:t>
+      </w:r>
+      <w:r>
+        <w:rPr>
+          <w:rFonts w:ascii="Times New Roman" w:hAnsi="Times New Roman" w:cs="Times New Roman"/>
+          <w:sz w:val="24"/>
+          <w:szCs w:val="24"/>
+        </w:rPr>
+        <w:t>be</w:t>
+      </w:r>
+      <w:r>
+        <w:rPr>
+          <w:rFonts w:ascii="Times New Roman" w:hAnsi="Times New Roman" w:cs="Times New Roman"/>
+          <w:spacing w:val="-3"/>
+          <w:sz w:val="24"/>
+          <w:szCs w:val="24"/>
+        </w:rPr>
+        <w:t xml:space="preserve"> </w:t>
+      </w:r>
+      <w:r>
+        <w:rPr>
+          <w:rFonts w:ascii="Times New Roman" w:hAnsi="Times New Roman" w:cs="Times New Roman"/>
+          <w:sz w:val="24"/>
+          <w:szCs w:val="24"/>
+        </w:rPr>
+        <w:t>accepted</w:t>
+      </w:r>
+      <w:r>
+        <w:rPr>
+          <w:rFonts w:ascii="Times New Roman" w:hAnsi="Times New Roman" w:cs="Times New Roman"/>
+          <w:spacing w:val="-3"/>
+          <w:sz w:val="24"/>
+          <w:szCs w:val="24"/>
+        </w:rPr>
+        <w:t xml:space="preserve"> </w:t>
+      </w:r>
+      <w:r>
+        <w:rPr>
+          <w:rFonts w:ascii="Times New Roman" w:hAnsi="Times New Roman" w:cs="Times New Roman"/>
+          <w:sz w:val="24"/>
+          <w:szCs w:val="24"/>
+        </w:rPr>
+        <w:t>until</w:t>
+      </w:r>
+      <w:r>
+        <w:rPr>
+          <w:rFonts w:ascii="Times New Roman" w:hAnsi="Times New Roman" w:cs="Times New Roman"/>
+          <w:spacing w:val="-3"/>
+          <w:sz w:val="24"/>
+          <w:szCs w:val="24"/>
+        </w:rPr>
+        <w:t xml:space="preserve"> </w:t>
+      </w:r>
+      <w:r>
+        <w:rPr>
+          <w:rFonts w:ascii="Times New Roman" w:hAnsi="Times New Roman" w:cs="Times New Roman"/>
+          <w:sz w:val="24"/>
+          <w:szCs w:val="24"/>
+        </w:rPr>
+        <w:t>the</w:t>
+      </w:r>
+      <w:r>
+        <w:rPr>
+          <w:rFonts w:ascii="Times New Roman" w:hAnsi="Times New Roman" w:cs="Times New Roman"/>
+          <w:spacing w:val="-3"/>
+          <w:sz w:val="24"/>
+          <w:szCs w:val="24"/>
+        </w:rPr>
+        <w:t xml:space="preserve"> </w:t>
+      </w:r>
+      <w:r>
+        <w:rPr>
+          <w:rFonts w:ascii="Times New Roman" w:hAnsi="Times New Roman" w:cs="Times New Roman"/>
+          <w:sz w:val="24"/>
+          <w:szCs w:val="24"/>
+        </w:rPr>
+        <w:t>end</w:t>
+      </w:r>
+      <w:r>
+        <w:rPr>
+          <w:rFonts w:ascii="Times New Roman" w:hAnsi="Times New Roman" w:cs="Times New Roman"/>
+          <w:spacing w:val="-3"/>
+          <w:sz w:val="24"/>
+          <w:szCs w:val="24"/>
+        </w:rPr>
+        <w:t xml:space="preserve"> </w:t>
+      </w:r>
+      <w:r>
+        <w:rPr>
+          <w:rFonts w:ascii="Times New Roman" w:hAnsi="Times New Roman" w:cs="Times New Roman"/>
+          <w:sz w:val="24"/>
+          <w:szCs w:val="24"/>
+        </w:rPr>
+        <w:t>of</w:t>
+      </w:r>
+      <w:r>
+        <w:rPr>
+          <w:rFonts w:ascii="Times New Roman" w:hAnsi="Times New Roman" w:cs="Times New Roman"/>
+          <w:spacing w:val="-3"/>
+          <w:sz w:val="24"/>
+          <w:szCs w:val="24"/>
+        </w:rPr>
+        <w:t xml:space="preserve"> </w:t>
+      </w:r>
+      <w:r>
+        <w:rPr>
+          <w:rFonts w:ascii="Times New Roman" w:hAnsi="Times New Roman" w:cs="Times New Roman"/>
+          <w:sz w:val="24"/>
+          <w:szCs w:val="24"/>
+        </w:rPr>
+        <w:t>semester</w:t>
+      </w:r>
+      <w:r>
+        <w:rPr>
+          <w:rFonts w:ascii="Times New Roman" w:hAnsi="Times New Roman" w:cs="Times New Roman"/>
+          <w:spacing w:val="-3"/>
+          <w:sz w:val="24"/>
+          <w:szCs w:val="24"/>
+        </w:rPr>
+        <w:t xml:space="preserve"> </w:t>
+      </w:r>
+      <w:r>
+        <w:rPr>
+          <w:rFonts w:ascii="Times New Roman" w:hAnsi="Times New Roman" w:cs="Times New Roman"/>
+          <w:sz w:val="24"/>
+          <w:szCs w:val="24"/>
+        </w:rPr>
+        <w:t>and</w:t>
+      </w:r>
+      <w:r>
+        <w:rPr>
+          <w:rFonts w:ascii="Times New Roman" w:hAnsi="Times New Roman" w:cs="Times New Roman"/>
+          <w:spacing w:val="-3"/>
+          <w:sz w:val="24"/>
+          <w:szCs w:val="24"/>
+        </w:rPr>
+        <w:t xml:space="preserve"> </w:t>
+      </w:r>
+      <w:r>
+        <w:rPr>
+          <w:rFonts w:ascii="Times New Roman" w:hAnsi="Times New Roman" w:cs="Times New Roman"/>
+          <w:sz w:val="24"/>
+          <w:szCs w:val="24"/>
+        </w:rPr>
+        <w:t>or</w:t>
+      </w:r>
+      <w:r>
+        <w:rPr>
+          <w:rFonts w:ascii="Times New Roman" w:hAnsi="Times New Roman" w:cs="Times New Roman"/>
+          <w:spacing w:val="-3"/>
+          <w:sz w:val="24"/>
+          <w:szCs w:val="24"/>
+        </w:rPr>
+        <w:t xml:space="preserve"> </w:t>
+      </w:r>
+      <w:r>
+        <w:rPr>
+          <w:rFonts w:ascii="Times New Roman" w:hAnsi="Times New Roman" w:cs="Times New Roman"/>
+          <w:sz w:val="24"/>
+          <w:szCs w:val="24"/>
+        </w:rPr>
+        <w:t>final</w:t>
+      </w:r>
+      <w:r>
+        <w:rPr>
+          <w:rFonts w:ascii="Times New Roman" w:hAnsi="Times New Roman" w:cs="Times New Roman"/>
+          <w:spacing w:val="-3"/>
+          <w:sz w:val="24"/>
+          <w:szCs w:val="24"/>
+        </w:rPr>
+        <w:t xml:space="preserve"> </w:t>
+      </w:r>
+      <w:r>
+        <w:rPr>
+          <w:rFonts w:ascii="Times New Roman" w:hAnsi="Times New Roman" w:cs="Times New Roman"/>
+          <w:sz w:val="24"/>
+          <w:szCs w:val="24"/>
+        </w:rPr>
+        <w:t>examination</w:t>
+      </w:r>
+      <w:r>
+        <w:rPr>
+          <w:rFonts w:ascii="Times New Roman" w:hAnsi="Times New Roman" w:cs="Times New Roman"/>
+          <w:spacing w:val="-3"/>
+          <w:sz w:val="24"/>
+          <w:szCs w:val="24"/>
+        </w:rPr>
+        <w:t xml:space="preserve"> </w:t>
+      </w:r>
+      <w:r>
+        <w:rPr>
+          <w:rFonts w:ascii="Times New Roman" w:hAnsi="Times New Roman" w:cs="Times New Roman"/>
+          <w:sz w:val="24"/>
+          <w:szCs w:val="24"/>
+        </w:rPr>
+        <w:t>of</w:t>
+      </w:r>
+      <w:r>
+        <w:rPr>
+          <w:rFonts w:ascii="Times New Roman" w:hAnsi="Times New Roman" w:cs="Times New Roman"/>
+          <w:spacing w:val="-4"/>
+          <w:sz w:val="24"/>
+          <w:szCs w:val="24"/>
+        </w:rPr>
+        <w:t xml:space="preserve"> </w:t>
+      </w:r>
+      <w:r>
+        <w:rPr>
+          <w:rFonts w:ascii="Times New Roman" w:hAnsi="Times New Roman" w:cs="Times New Roman"/>
+          <w:sz w:val="24"/>
+          <w:szCs w:val="24"/>
+        </w:rPr>
+        <w:t>module</w:t>
+      </w:r>
+      <w:r>
+        <w:rPr>
+          <w:rFonts w:ascii="Times New Roman" w:hAnsi="Times New Roman" w:cs="Times New Roman"/>
+          <w:spacing w:val="-4"/>
+          <w:sz w:val="24"/>
+          <w:szCs w:val="24"/>
+        </w:rPr>
+        <w:t xml:space="preserve"> </w:t>
+      </w:r>
+      <w:r>
+        <w:rPr>
+          <w:rFonts w:ascii="Times New Roman" w:hAnsi="Times New Roman" w:cs="Times New Roman"/>
+          <w:sz w:val="24"/>
+          <w:szCs w:val="24"/>
+        </w:rPr>
+        <w:t>or completion of LUC R&amp;D projects.</w:t>
+      </w:r>
+    </w:p>
+    <w:p>
+      <w:pPr>
+        <w:pStyle w:val="ListParagraph"/>
+        <w:widowControl w:val="0"/>
+        <w:tabs>
+          <w:tab w:val="left" w:pos="1800"/>
+        </w:tabs>
+        <w:autoSpaceDE w:val="0"/>
+        <w:autoSpaceDN w:val="0"/>
+        <w:spacing w:after="0" w:line="360" w:lineRule="auto"/>
+        <w:ind w:left="1800" w:right="812"/>
+        <w:contextualSpacing w:val="0"/>
+        <w:rPr>
+          <w:rFonts w:ascii="Times New Roman" w:hAnsi="Times New Roman" w:cs="Times New Roman"/>
+          <w:sz w:val="24"/>
+          <w:szCs w:val="24"/>
+        </w:rPr>
+      </w:pPr>
     </w:p>
     <w:p>
       <w:pPr>
@@ -2003,31 +2278,7 @@
           <w:sz w:val="24"/>
           <w:lang w:val="en-MY"/>
         </w:rPr>
-        <w:t>15</w:t>
-      </w:r>
-      <w:r>
-        <w:rPr>
-          <w:rFonts w:ascii="Times New Roman" w:hAnsi="Times New Roman" w:cs="Times New Roman"/>
-          <w:sz w:val="24"/>
-          <w:lang w:val="en-MY"/>
-        </w:rPr>
-        <w:t>, 000.00</w:t>
-      </w:r>
-      <w:r>
-        <w:rPr>
-          <w:rFonts w:ascii="Times New Roman" w:hAnsi="Times New Roman" w:cs="Times New Roman"/>
-          <w:sz w:val="24"/>
-          <w:lang w:val="en-MY"/>
-        </w:rPr>
-        <w:t xml:space="preserve"> per year incurred in Nigeria only. D</w:t>
-      </w:r>
-      <w:r>
-        <w:rPr>
-          <w:rFonts w:ascii="Times New Roman" w:hAnsi="Times New Roman" w:cs="Times New Roman"/>
-          <w:sz w:val="24"/>
-          <w:lang w:val="en-MY"/>
-        </w:rPr>
-        <w:t>ental expenses are not included, in place of medical insurance.</w:t>
+        <w:t>15, 000.00 per year incurred in Nigeria only. Dental expenses are not included.</w:t>
       </w:r>
     </w:p>
     <w:p>
@@ -2104,7 +2355,23 @@
           <w:sz w:val="24"/>
           <w:lang w:val="en-MY"/>
         </w:rPr>
-        <w:t>The Management reserves the right to transfer or second you to any Department / branch within the University and this include locations or department /branch not in existence at the time of recruitment.</w:t>
+        <w:t xml:space="preserve">The Management reserves the right to transfer or second you to any Department / branch within the </w:t>
+      </w:r>
+      <w:r>
+        <w:rPr>
+          <w:rFonts w:ascii="Times New Roman" w:hAnsi="Times New Roman" w:cs="Times New Roman"/>
+          <w:sz w:val="24"/>
+          <w:lang w:val="en-MY"/>
+        </w:rPr>
+        <w:t>College</w:t>
+      </w:r>
+      <w:r>
+        <w:rPr>
+          <w:rFonts w:ascii="Times New Roman" w:hAnsi="Times New Roman" w:cs="Times New Roman"/>
+          <w:sz w:val="24"/>
+          <w:lang w:val="en-MY"/>
+        </w:rPr>
+        <w:t xml:space="preserve"> and this include locations or department /branch not in existence at the time of recruitment.</w:t>
       </w:r>
     </w:p>
     <w:p>
@@ -2175,7 +2442,23 @@
           <w:sz w:val="24"/>
           <w:lang w:val="en-MY"/>
         </w:rPr>
-        <w:t>You are expected to upgrade yourself in the education and training related field. It is compulsory for you to attend any seminar/course that is conducted by the University and/or any other relevant institutions. It is mandatory that at least 40 hours of CPD points are accumulated in a year. CPD hours should be taken outside the normal office weeks.</w:t>
+        <w:t xml:space="preserve">You are expected to upgrade yourself in the education and training related field. It is compulsory for you to attend any seminar/course that is conducted by the </w:t>
+      </w:r>
+      <w:r>
+        <w:rPr>
+          <w:rFonts w:ascii="Times New Roman" w:hAnsi="Times New Roman" w:cs="Times New Roman"/>
+          <w:sz w:val="24"/>
+          <w:lang w:val="en-MY"/>
+        </w:rPr>
+        <w:t>College</w:t>
+      </w:r>
+      <w:r>
+        <w:rPr>
+          <w:rFonts w:ascii="Times New Roman" w:hAnsi="Times New Roman" w:cs="Times New Roman"/>
+          <w:sz w:val="24"/>
+          <w:lang w:val="en-MY"/>
+        </w:rPr>
+        <w:t xml:space="preserve"> and/or any other relevant institutions. It is mandatory that at least 40 hours of CPD points are accumulated in a year. CPD hours should be taken outside the normal office weeks.</w:t>
       </w:r>
     </w:p>
     <w:p>
@@ -2211,9 +2494,24 @@
           <w:sz w:val="24"/>
           <w:lang w:val="en-MY"/>
         </w:rPr>
-        <w:t>During your employment all work that include lecture note, power point presentation, course structures, audio and video recording, software projects etc. will belong to Lincoln University</w:t>
-      </w:r>
-      <w:proofErr w:type="gramStart"/>
+        <w:t xml:space="preserve">During your employment all work that include lecture note, power point presentation, course structures, audio and video recording, software projects etc. will belong to Lincoln </w:t>
+      </w:r>
+      <w:r>
+        <w:rPr>
+          <w:rFonts w:ascii="Times New Roman" w:hAnsi="Times New Roman" w:cs="Times New Roman"/>
+          <w:sz w:val="24"/>
+          <w:lang w:val="en-MY"/>
+        </w:rPr>
+        <w:t>College</w:t>
+      </w:r>
+      <w:r>
+        <w:rPr>
+          <w:rFonts w:ascii="Times New Roman" w:hAnsi="Times New Roman" w:cs="Times New Roman"/>
+          <w:sz w:val="24"/>
+          <w:lang w:val="en-MY"/>
+        </w:rPr>
+        <w:t>. All types of intellectual property right will belong to Lincoln College</w:t>
+      </w:r>
       <w:r>
         <w:rPr>
           <w:rFonts w:ascii="Times New Roman" w:hAnsi="Times New Roman" w:cs="Times New Roman"/>
@@ -2222,16 +2520,6 @@
         </w:rPr>
         <w:t>.</w:t>
       </w:r>
-      <w:r>
-        <w:rPr>
-          <w:rFonts w:ascii="Times New Roman" w:hAnsi="Times New Roman" w:cs="Times New Roman"/>
-          <w:color w:val="FF0000"/>
-          <w:sz w:val="24"/>
-          <w:lang w:val="en-MY"/>
-        </w:rPr>
-        <w:t>.</w:t>
-      </w:r>
-      <w:proofErr w:type="gramEnd"/>
     </w:p>
     <w:p>
       <w:pPr>
@@ -2276,7 +2564,11 @@
           <w:ilvl w:val="2"/>
           <w:numId w:val="1"/>
         </w:numPr>
-        <w:spacing w:line="360" w:lineRule="auto"/>
+        <w:tabs>
+          <w:tab w:val="left" w:pos="1440"/>
+        </w:tabs>
+        <w:spacing w:line="360" w:lineRule="auto"/>
+        <w:ind w:left="1350"/>
         <w:rPr>
           <w:rFonts w:ascii="Times New Roman" w:hAnsi="Times New Roman" w:cs="Times New Roman"/>
           <w:sz w:val="24"/>
@@ -2306,9 +2598,8 @@
         <w:rPr>
           <w:rFonts w:ascii="Times New Roman" w:hAnsi="Times New Roman" w:cs="Times New Roman"/>
           <w:sz w:val="24"/>
-          <w:lang w:val="en-MY"/>
-        </w:rPr>
-        <w:t>All full time/part time/contract employees of the University are forbidden from engaging themselves directly or indirectly in any other employment, paid or otherwise or any retainers fee except with the written consent of the University.</w:t>
+        </w:rPr>
+        <w:t>Employees may engage in external employment or professional activities provided that such engagements do not conflict with or interfere with their duties and working hours at the University. Any external engagement must not compromise the employee’s performance or responsibilities, and the University reserves the right to request disclosure of such engagements where necessary.</w:t>
       </w:r>
     </w:p>
     <w:p>
@@ -2322,6 +2613,7 @@
           <w:tab w:val="left" w:pos="1440"/>
         </w:tabs>
         <w:spacing w:line="360" w:lineRule="auto"/>
+        <w:ind w:left="1350"/>
         <w:rPr>
           <w:rFonts w:ascii="Times New Roman" w:hAnsi="Times New Roman" w:cs="Times New Roman"/>
           <w:sz w:val="24"/>
@@ -2344,15 +2636,48 @@
           <w:sz w:val="24"/>
           <w:lang w:val="en-MY"/>
         </w:rPr>
-        <w:t xml:space="preserve"> </w:t>
-      </w:r>
-      <w:r>
-        <w:rPr>
-          <w:rFonts w:ascii="Times New Roman" w:hAnsi="Times New Roman" w:cs="Times New Roman"/>
-          <w:sz w:val="24"/>
-          <w:lang w:val="en-MY"/>
-        </w:rPr>
-        <w:t>Any proprietary rights conceived, discovered or created during or in consequence of your services in the University will belong to the University absolutely. These includes without limitation all copyright, patent and design rights in any lecturer notes/teaching modules and materials, invention, design, software development, discovery or improvement, the model, computerized programme, database, documentation or confidential information. You should communicate promptly to the University all information concerning such property rights and if requested must provide assistance considered necessary by the University to secure the vesting of such right where applicable in the University</w:t>
+        <w:t xml:space="preserve"> Any proprietary rights conceived discovered or created during or in consequence of your services in the College will belong to the College </w:t>
+      </w:r>
+      <w:r>
+        <w:rPr>
+          <w:rFonts w:ascii="Times New Roman" w:hAnsi="Times New Roman" w:cs="Times New Roman"/>
+          <w:sz w:val="24"/>
+          <w:lang w:val="en-MY"/>
+        </w:rPr>
+        <w:lastRenderedPageBreak/>
+        <w:t xml:space="preserve">absolutely. These includes without limitation all copyright, patent and design rights in any lecturer notes/teaching modules and materials, invention, design, software development, discovery or improvement, the model, computerized programme, database, documentation or confidential information. You should communicate promptly to the </w:t>
+      </w:r>
+      <w:r>
+        <w:rPr>
+          <w:rFonts w:ascii="Times New Roman" w:hAnsi="Times New Roman" w:cs="Times New Roman"/>
+          <w:sz w:val="24"/>
+          <w:lang w:val="en-MY"/>
+        </w:rPr>
+        <w:t>College</w:t>
+      </w:r>
+      <w:r>
+        <w:rPr>
+          <w:rFonts w:ascii="Times New Roman" w:hAnsi="Times New Roman" w:cs="Times New Roman"/>
+          <w:sz w:val="24"/>
+          <w:lang w:val="en-MY"/>
+        </w:rPr>
+        <w:t xml:space="preserve"> all information concerning such property rights and if requested must provide assistance considered necessary by the </w:t>
+      </w:r>
+      <w:r>
+        <w:rPr>
+          <w:rFonts w:ascii="Times New Roman" w:hAnsi="Times New Roman" w:cs="Times New Roman"/>
+          <w:sz w:val="24"/>
+          <w:lang w:val="en-MY"/>
+        </w:rPr>
+        <w:t>College</w:t>
+      </w:r>
+      <w:r>
+        <w:rPr>
+          <w:rFonts w:ascii="Times New Roman" w:hAnsi="Times New Roman" w:cs="Times New Roman"/>
+          <w:sz w:val="24"/>
+          <w:lang w:val="en-MY"/>
+        </w:rPr>
+        <w:t xml:space="preserve"> to secure the vesting of such right where applicable in the College</w:t>
       </w:r>
       <w:r>
         <w:rPr>
@@ -2374,6 +2699,7 @@
           <w:tab w:val="left" w:pos="1440"/>
         </w:tabs>
         <w:spacing w:line="360" w:lineRule="auto"/>
+        <w:ind w:left="1350"/>
         <w:rPr>
           <w:rFonts w:ascii="Times New Roman" w:hAnsi="Times New Roman" w:cs="Times New Roman"/>
           <w:sz w:val="24"/>
@@ -2396,32 +2722,7 @@
           <w:sz w:val="24"/>
           <w:lang w:val="en-MY"/>
         </w:rPr>
-        <w:t xml:space="preserve"> </w:t>
-      </w:r>
-      <w:r>
-        <w:rPr>
-          <w:rFonts w:ascii="Times New Roman" w:hAnsi="Times New Roman" w:cs="Times New Roman"/>
-          <w:sz w:val="24"/>
-          <w:lang w:val="en-MY"/>
-        </w:rPr>
-        <w:t xml:space="preserve">The Management reserves the right to alter any of the terms and conditions of your employment. However, should </w:t>
-      </w:r>
-      <w:r>
-        <w:rPr>
-          <w:rFonts w:ascii="Times New Roman" w:hAnsi="Times New Roman" w:cs="Times New Roman"/>
-          <w:sz w:val="24"/>
-          <w:lang w:val="en-MY"/>
-        </w:rPr>
-        <w:lastRenderedPageBreak/>
-        <w:t>there be any alterations to any of the clauses, the new insertion or implementation will automaticall</w:t>
-      </w:r>
-      <w:r>
-        <w:rPr>
-          <w:rFonts w:ascii="Times New Roman" w:hAnsi="Times New Roman" w:cs="Times New Roman"/>
-          <w:sz w:val="24"/>
-          <w:lang w:val="en-MY"/>
-        </w:rPr>
-        <w:t>y supersede the existing clause</w:t>
+        <w:t xml:space="preserve"> The Management reserves the right to alter any of the terms and conditions of your employment. However, should there be any alterations to any of the clauses, the new insertion or implementation will automatically supersede the existing clause</w:t>
       </w:r>
       <w:r>
         <w:rPr>
@@ -2443,6 +2744,7 @@
           <w:tab w:val="left" w:pos="1440"/>
         </w:tabs>
         <w:spacing w:line="360" w:lineRule="auto"/>
+        <w:ind w:left="1350"/>
         <w:rPr>
           <w:rFonts w:ascii="Times New Roman" w:hAnsi="Times New Roman" w:cs="Times New Roman"/>
           <w:sz w:val="24"/>
@@ -2465,23 +2767,23 @@
           <w:sz w:val="24"/>
           <w:lang w:val="en-MY"/>
         </w:rPr>
-        <w:t xml:space="preserve"> </w:t>
-      </w:r>
-      <w:r>
-        <w:rPr>
-          <w:rFonts w:ascii="Times New Roman" w:hAnsi="Times New Roman" w:cs="Times New Roman"/>
-          <w:sz w:val="24"/>
-          <w:lang w:val="en-MY"/>
-        </w:rPr>
-        <w:t>You shall not either during the continuance of this contract of employment or thereafter disclose or divulge any trade secrets, proprietary rights, transactions or confidential information in or relating to the University business which may come to your knowledge or in your possession during the course of this contract of service</w:t>
-      </w:r>
-      <w:r>
-        <w:rPr>
-          <w:rFonts w:ascii="Times New Roman" w:hAnsi="Times New Roman" w:cs="Times New Roman"/>
-          <w:sz w:val="24"/>
-          <w:lang w:val="en-MY"/>
-        </w:rPr>
-        <w:t>.</w:t>
+        <w:t xml:space="preserve"> You shall not either during the continuance of this contract of employment or thereafter disclose or divulge any trade secrets, proprietary rights, transactions or confidential information in or relating to the </w:t>
+      </w:r>
+      <w:r>
+        <w:rPr>
+          <w:rFonts w:ascii="Times New Roman" w:hAnsi="Times New Roman" w:cs="Times New Roman"/>
+          <w:sz w:val="24"/>
+          <w:lang w:val="en-MY"/>
+        </w:rPr>
+        <w:t>College</w:t>
+      </w:r>
+      <w:r>
+        <w:rPr>
+          <w:rFonts w:ascii="Times New Roman" w:hAnsi="Times New Roman" w:cs="Times New Roman"/>
+          <w:sz w:val="24"/>
+          <w:lang w:val="en-MY"/>
+        </w:rPr>
+        <w:t xml:space="preserve"> business which may come to your knowledge or in your possession during the course of this contract of service.</w:t>
       </w:r>
     </w:p>
     <w:p>
@@ -2597,7 +2899,7 @@
           <w:u w:val="single"/>
         </w:rPr>
         <w:drawing>
-          <wp:anchor distT="0" distB="0" distL="114300" distR="114300" simplePos="0" relativeHeight="251659264" behindDoc="0" locked="0" layoutInCell="1" allowOverlap="1" wp14:anchorId="51A92507" wp14:editId="60FE4C84">
+          <wp:anchor distT="0" distB="0" distL="114300" distR="114300" simplePos="0" relativeHeight="251659264" behindDoc="0" locked="0" layoutInCell="1" allowOverlap="1" wp14:anchorId="79EF9A8E" wp14:editId="78093391">
             <wp:simplePos x="0" y="0"/>
             <wp:positionH relativeFrom="column">
               <wp:posOffset>436880</wp:posOffset>
@@ -2652,272 +2954,96 @@
           <w:sz w:val="24"/>
           <w:lang w:val="en-MY"/>
         </w:rPr>
-        <w:t>You</w:t>
-      </w:r>
-      <w:r>
-        <w:rPr>
-          <w:rFonts w:ascii="Times New Roman" w:hAnsi="Times New Roman" w:cs="Times New Roman"/>
-          <w:sz w:val="24"/>
-          <w:lang w:val="en-MY"/>
-        </w:rPr>
-        <w:t>rs</w:t>
-      </w:r>
-      <w:bookmarkStart w:id="0" w:name="_GoBack"/>
-      <w:bookmarkEnd w:id="0"/>
-      <w:r>
-        <w:rPr>
-          <w:rFonts w:ascii="Times New Roman" w:hAnsi="Times New Roman" w:cs="Times New Roman"/>
-          <w:sz w:val="24"/>
-          <w:lang w:val="en-MY"/>
-        </w:rPr>
-        <w:t xml:space="preserve"> Faithfully, </w:t>
-      </w:r>
-    </w:p>
-    <w:p>
-      <w:pPr>
-        <w:pStyle w:val="ListParagraph"/>
-        <w:tabs>
-          <w:tab w:val="left" w:pos="1440"/>
-        </w:tabs>
-        <w:spacing w:line="360" w:lineRule="auto"/>
-        <w:rPr>
-          <w:rFonts w:ascii="Times New Roman" w:hAnsi="Times New Roman" w:cs="Times New Roman"/>
-          <w:b/>
-          <w:sz w:val="24"/>
-          <w:lang w:val="en-MY"/>
-        </w:rPr>
-      </w:pPr>
-      <w:r>
-        <w:rPr>
-          <w:rFonts w:ascii="Times New Roman" w:hAnsi="Times New Roman" w:cs="Times New Roman"/>
-          <w:b/>
-          <w:sz w:val="24"/>
-          <w:lang w:val="en-MY"/>
-        </w:rPr>
-        <w:t xml:space="preserve">PROF. </w:t>
-      </w:r>
-      <w:r>
-        <w:rPr>
-          <w:rFonts w:ascii="Times New Roman" w:hAnsi="Times New Roman" w:cs="Times New Roman"/>
-          <w:b/>
-          <w:sz w:val="24"/>
-          <w:lang w:val="en-MY"/>
-        </w:rPr>
-        <w:t>DR. MURTADHO M. ALAO</w:t>
-      </w:r>
-    </w:p>
-    <w:p>
-      <w:pPr>
-        <w:pStyle w:val="ListParagraph"/>
-        <w:tabs>
-          <w:tab w:val="left" w:pos="1440"/>
-        </w:tabs>
-        <w:spacing w:line="360" w:lineRule="auto"/>
-        <w:rPr>
-          <w:rFonts w:ascii="Times New Roman" w:hAnsi="Times New Roman" w:cs="Times New Roman"/>
-          <w:b/>
-          <w:sz w:val="24"/>
-          <w:lang w:val="en-MY"/>
-        </w:rPr>
-      </w:pPr>
-      <w:r>
-        <w:rPr>
-          <w:rFonts w:ascii="Times New Roman" w:hAnsi="Times New Roman" w:cs="Times New Roman"/>
-          <w:b/>
-          <w:sz w:val="24"/>
-          <w:lang w:val="en-MY"/>
-        </w:rPr>
-        <w:t>VICE-PRESIDENT/</w:t>
-      </w:r>
-      <w:r>
-        <w:rPr>
-          <w:rFonts w:ascii="Times New Roman" w:hAnsi="Times New Roman" w:cs="Times New Roman"/>
-          <w:b/>
-          <w:sz w:val="24"/>
-          <w:lang w:val="en-MY"/>
-        </w:rPr>
-        <w:t>C.E.O</w:t>
-      </w:r>
-    </w:p>
-    <w:p>
-      <w:pPr>
-        <w:pStyle w:val="ListParagraph"/>
-        <w:tabs>
-          <w:tab w:val="left" w:pos="1440"/>
-        </w:tabs>
-        <w:spacing w:line="360" w:lineRule="auto"/>
-        <w:rPr>
-          <w:rFonts w:ascii="Times New Roman" w:hAnsi="Times New Roman" w:cs="Times New Roman"/>
-          <w:b/>
-          <w:sz w:val="24"/>
-          <w:lang w:val="en-MY"/>
-        </w:rPr>
-      </w:pPr>
-    </w:p>
-    <w:p>
-      <w:pPr>
-        <w:pStyle w:val="ListParagraph"/>
-        <w:tabs>
-          <w:tab w:val="left" w:pos="1440"/>
-        </w:tabs>
-        <w:spacing w:line="360" w:lineRule="auto"/>
-        <w:rPr>
-          <w:rFonts w:ascii="Times New Roman" w:hAnsi="Times New Roman" w:cs="Times New Roman"/>
-          <w:b/>
-          <w:sz w:val="24"/>
-          <w:lang w:val="en-MY"/>
-        </w:rPr>
-      </w:pPr>
-    </w:p>
-    <w:p>
-      <w:pPr>
-        <w:pStyle w:val="ListParagraph"/>
-        <w:tabs>
-          <w:tab w:val="left" w:pos="1440"/>
-        </w:tabs>
-        <w:spacing w:line="360" w:lineRule="auto"/>
-        <w:rPr>
-          <w:rFonts w:ascii="Times New Roman" w:hAnsi="Times New Roman" w:cs="Times New Roman"/>
-          <w:b/>
-          <w:sz w:val="24"/>
-          <w:lang w:val="en-MY"/>
-        </w:rPr>
-      </w:pPr>
-    </w:p>
-    <w:p>
-      <w:pPr>
-        <w:pStyle w:val="ListParagraph"/>
-        <w:tabs>
-          <w:tab w:val="left" w:pos="1440"/>
-        </w:tabs>
-        <w:spacing w:line="360" w:lineRule="auto"/>
-        <w:rPr>
-          <w:rFonts w:ascii="Times New Roman" w:hAnsi="Times New Roman" w:cs="Times New Roman"/>
-          <w:b/>
-          <w:sz w:val="24"/>
-          <w:lang w:val="en-MY"/>
-        </w:rPr>
-      </w:pPr>
-    </w:p>
-    <w:p>
-      <w:pPr>
-        <w:pStyle w:val="ListParagraph"/>
-        <w:tabs>
-          <w:tab w:val="left" w:pos="1440"/>
-        </w:tabs>
-        <w:spacing w:line="360" w:lineRule="auto"/>
-        <w:rPr>
-          <w:rFonts w:ascii="Times New Roman" w:hAnsi="Times New Roman" w:cs="Times New Roman"/>
-          <w:b/>
-          <w:sz w:val="24"/>
-          <w:lang w:val="en-MY"/>
-        </w:rPr>
-      </w:pPr>
-    </w:p>
-    <w:p>
-      <w:pPr>
-        <w:pStyle w:val="ListParagraph"/>
-        <w:tabs>
-          <w:tab w:val="left" w:pos="1440"/>
-        </w:tabs>
-        <w:spacing w:line="360" w:lineRule="auto"/>
-        <w:rPr>
-          <w:rFonts w:ascii="Times New Roman" w:hAnsi="Times New Roman" w:cs="Times New Roman"/>
-          <w:b/>
-          <w:sz w:val="24"/>
-          <w:lang w:val="en-MY"/>
-        </w:rPr>
-      </w:pPr>
-    </w:p>
-    <w:p>
-      <w:pPr>
-        <w:pStyle w:val="ListParagraph"/>
-        <w:tabs>
-          <w:tab w:val="left" w:pos="1440"/>
-        </w:tabs>
-        <w:spacing w:line="360" w:lineRule="auto"/>
-        <w:rPr>
-          <w:rFonts w:ascii="Times New Roman" w:hAnsi="Times New Roman" w:cs="Times New Roman"/>
-          <w:b/>
-          <w:sz w:val="24"/>
-          <w:lang w:val="en-MY"/>
-        </w:rPr>
-      </w:pPr>
-    </w:p>
-    <w:p>
-      <w:pPr>
-        <w:pStyle w:val="ListParagraph"/>
-        <w:tabs>
-          <w:tab w:val="left" w:pos="1440"/>
-        </w:tabs>
-        <w:spacing w:line="360" w:lineRule="auto"/>
-        <w:rPr>
-          <w:rFonts w:ascii="Times New Roman" w:hAnsi="Times New Roman" w:cs="Times New Roman"/>
-          <w:b/>
-          <w:sz w:val="24"/>
-          <w:lang w:val="en-MY"/>
-        </w:rPr>
-      </w:pPr>
-    </w:p>
-    <w:p>
-      <w:pPr>
-        <w:pStyle w:val="ListParagraph"/>
-        <w:tabs>
-          <w:tab w:val="left" w:pos="1440"/>
-        </w:tabs>
-        <w:spacing w:line="360" w:lineRule="auto"/>
-        <w:rPr>
-          <w:rFonts w:ascii="Times New Roman" w:hAnsi="Times New Roman" w:cs="Times New Roman"/>
-          <w:b/>
-          <w:sz w:val="24"/>
-          <w:lang w:val="en-MY"/>
-        </w:rPr>
-      </w:pPr>
-    </w:p>
-    <w:p>
-      <w:pPr>
-        <w:pStyle w:val="ListParagraph"/>
-        <w:tabs>
-          <w:tab w:val="left" w:pos="1440"/>
-        </w:tabs>
-        <w:spacing w:line="360" w:lineRule="auto"/>
-        <w:rPr>
-          <w:rFonts w:ascii="Times New Roman" w:hAnsi="Times New Roman" w:cs="Times New Roman"/>
-          <w:b/>
-          <w:sz w:val="24"/>
-          <w:lang w:val="en-MY"/>
-        </w:rPr>
-      </w:pPr>
-    </w:p>
-    <w:p>
-      <w:pPr>
-        <w:pStyle w:val="ListParagraph"/>
-        <w:tabs>
-          <w:tab w:val="left" w:pos="1440"/>
-        </w:tabs>
-        <w:spacing w:line="360" w:lineRule="auto"/>
-        <w:rPr>
-          <w:rFonts w:ascii="Times New Roman" w:hAnsi="Times New Roman" w:cs="Times New Roman"/>
-          <w:b/>
-          <w:sz w:val="24"/>
-          <w:lang w:val="en-MY"/>
-        </w:rPr>
-      </w:pPr>
-    </w:p>
-    <w:p>
-      <w:pPr>
-        <w:pStyle w:val="ListParagraph"/>
-        <w:tabs>
-          <w:tab w:val="left" w:pos="1440"/>
-        </w:tabs>
-        <w:spacing w:line="360" w:lineRule="auto"/>
-        <w:rPr>
-          <w:rFonts w:ascii="Times New Roman" w:hAnsi="Times New Roman" w:cs="Times New Roman"/>
-          <w:b/>
-          <w:sz w:val="24"/>
-          <w:lang w:val="en-MY"/>
-        </w:rPr>
-      </w:pPr>
+        <w:t xml:space="preserve">You Faithfully, </w:t>
+      </w:r>
+    </w:p>
+    <w:p>
+      <w:pPr>
+        <w:pStyle w:val="ListParagraph"/>
+        <w:tabs>
+          <w:tab w:val="left" w:pos="1440"/>
+        </w:tabs>
+        <w:spacing w:line="360" w:lineRule="auto"/>
+        <w:rPr>
+          <w:rFonts w:ascii="Times New Roman" w:hAnsi="Times New Roman" w:cs="Times New Roman"/>
+          <w:b/>
+          <w:sz w:val="24"/>
+          <w:lang w:val="en-MY"/>
+        </w:rPr>
+      </w:pPr>
+      <w:r>
+        <w:rPr>
+          <w:rFonts w:ascii="Times New Roman" w:hAnsi="Times New Roman" w:cs="Times New Roman"/>
+          <w:b/>
+          <w:sz w:val="24"/>
+          <w:lang w:val="en-MY"/>
+        </w:rPr>
+        <w:t>PROF. DR. MURTADHO M. ALAO</w:t>
+      </w:r>
+    </w:p>
+    <w:p>
+      <w:pPr>
+        <w:ind w:firstLine="720"/>
+        <w:rPr>
+          <w:rFonts w:ascii="Times New Roman" w:hAnsi="Times New Roman" w:cs="Times New Roman"/>
+          <w:sz w:val="24"/>
+          <w:szCs w:val="24"/>
+          <w:lang w:val="en-MY"/>
+        </w:rPr>
+      </w:pPr>
+      <w:r>
+        <w:rPr>
+          <w:rFonts w:ascii="Times New Roman" w:hAnsi="Times New Roman" w:cs="Times New Roman"/>
+          <w:sz w:val="24"/>
+          <w:szCs w:val="24"/>
+          <w:lang w:val="en-MY"/>
+        </w:rPr>
+        <w:t>Vice-President/Chief Executive Officer</w:t>
+      </w:r>
+    </w:p>
+    <w:p>
+      <w:pPr>
+        <w:pStyle w:val="ListParagraph"/>
+        <w:tabs>
+          <w:tab w:val="left" w:pos="1440"/>
+        </w:tabs>
+        <w:spacing w:line="360" w:lineRule="auto"/>
+        <w:rPr>
+          <w:rFonts w:ascii="Times New Roman" w:hAnsi="Times New Roman" w:cs="Times New Roman"/>
+          <w:b/>
+          <w:sz w:val="24"/>
+          <w:lang w:val="en-MY"/>
+        </w:rPr>
+      </w:pPr>
+    </w:p>
+    <w:p>
+      <w:pPr>
+        <w:rPr>
+          <w:rFonts w:ascii="Times New Roman" w:hAnsi="Times New Roman" w:cs="Times New Roman"/>
+          <w:b/>
+          <w:sz w:val="24"/>
+          <w:lang w:val="en-MY"/>
+        </w:rPr>
+      </w:pPr>
+    </w:p>
+    <w:p>
+      <w:pPr>
+        <w:rPr>
+          <w:rFonts w:ascii="Times New Roman" w:hAnsi="Times New Roman" w:cs="Times New Roman"/>
+          <w:b/>
+          <w:sz w:val="24"/>
+          <w:lang w:val="en-MY"/>
+        </w:rPr>
+      </w:pPr>
+      <w:r>
+        <w:rPr>
+          <w:rFonts w:ascii="Times New Roman" w:hAnsi="Times New Roman" w:cs="Times New Roman"/>
+          <w:b/>
+          <w:sz w:val="24"/>
+          <w:lang w:val="en-MY"/>
+        </w:rPr>
+        <w:br w:type="page"/>
+      </w:r>
     </w:p>
     <w:p>
       <w:pPr>
@@ -2934,107 +3060,14 @@
           <w:lang w:val="en-MY"/>
         </w:rPr>
       </w:pPr>
-    </w:p>
-    <w:p>
-      <w:pPr>
-        <w:pStyle w:val="ListParagraph"/>
-        <w:tabs>
-          <w:tab w:val="left" w:pos="1440"/>
-        </w:tabs>
-        <w:spacing w:line="360" w:lineRule="auto"/>
-        <w:jc w:val="center"/>
-        <w:rPr>
-          <w:rFonts w:ascii="Times New Roman" w:hAnsi="Times New Roman" w:cs="Times New Roman"/>
-          <w:b/>
-          <w:sz w:val="24"/>
-          <w:lang w:val="en-MY"/>
-        </w:rPr>
-      </w:pPr>
-    </w:p>
-    <w:p>
-      <w:pPr>
-        <w:pStyle w:val="ListParagraph"/>
-        <w:tabs>
-          <w:tab w:val="left" w:pos="1440"/>
-        </w:tabs>
-        <w:spacing w:line="360" w:lineRule="auto"/>
-        <w:jc w:val="center"/>
-        <w:rPr>
-          <w:rFonts w:ascii="Times New Roman" w:hAnsi="Times New Roman" w:cs="Times New Roman"/>
-          <w:b/>
-          <w:sz w:val="24"/>
-          <w:lang w:val="en-MY"/>
-        </w:rPr>
-      </w:pPr>
-    </w:p>
-    <w:p>
-      <w:pPr>
-        <w:pStyle w:val="ListParagraph"/>
-        <w:tabs>
-          <w:tab w:val="left" w:pos="1440"/>
-        </w:tabs>
-        <w:spacing w:line="360" w:lineRule="auto"/>
-        <w:jc w:val="center"/>
-        <w:rPr>
-          <w:rFonts w:ascii="Times New Roman" w:hAnsi="Times New Roman" w:cs="Times New Roman"/>
-          <w:b/>
-          <w:sz w:val="24"/>
-          <w:lang w:val="en-MY"/>
-        </w:rPr>
-      </w:pPr>
-    </w:p>
-    <w:p>
-      <w:pPr>
-        <w:pStyle w:val="ListParagraph"/>
-        <w:tabs>
-          <w:tab w:val="left" w:pos="1440"/>
-        </w:tabs>
-        <w:spacing w:line="360" w:lineRule="auto"/>
-        <w:jc w:val="center"/>
-        <w:rPr>
-          <w:rFonts w:ascii="Times New Roman" w:hAnsi="Times New Roman" w:cs="Times New Roman"/>
-          <w:b/>
-          <w:sz w:val="24"/>
-          <w:lang w:val="en-MY"/>
-        </w:rPr>
-      </w:pPr>
-    </w:p>
-    <w:p>
-      <w:pPr>
-        <w:tabs>
-          <w:tab w:val="left" w:pos="1440"/>
-        </w:tabs>
-        <w:spacing w:line="360" w:lineRule="auto"/>
-        <w:rPr>
-          <w:rFonts w:ascii="Times New Roman" w:hAnsi="Times New Roman" w:cs="Times New Roman"/>
-          <w:b/>
-          <w:sz w:val="24"/>
-          <w:lang w:val="en-MY"/>
-        </w:rPr>
-      </w:pPr>
-    </w:p>
-    <w:p>
-      <w:pPr>
-        <w:pStyle w:val="ListParagraph"/>
-        <w:tabs>
-          <w:tab w:val="left" w:pos="1440"/>
-        </w:tabs>
-        <w:spacing w:line="360" w:lineRule="auto"/>
-        <w:jc w:val="center"/>
-        <w:rPr>
-          <w:rFonts w:ascii="Times New Roman" w:hAnsi="Times New Roman" w:cs="Times New Roman"/>
-          <w:b/>
-          <w:sz w:val="24"/>
-          <w:lang w:val="en-MY"/>
-        </w:rPr>
-      </w:pPr>
-      <w:r>
-        <w:rPr>
-          <w:rFonts w:ascii="Times New Roman" w:hAnsi="Times New Roman" w:cs="Times New Roman"/>
-          <w:b/>
-          <w:sz w:val="24"/>
-          <w:lang w:val="en-MY"/>
-        </w:rPr>
+      <w:r>
+        <w:rPr>
+          <w:rFonts w:ascii="Times New Roman" w:hAnsi="Times New Roman" w:cs="Times New Roman"/>
+          <w:b/>
+          <w:sz w:val="24"/>
+          <w:lang w:val="en-MY"/>
+        </w:rPr>
+        <w:lastRenderedPageBreak/>
         <w:t>ACCEPTANCE</w:t>
       </w:r>
     </w:p>
@@ -3066,43 +3099,7 @@
           <w:sz w:val="24"/>
           <w:lang w:val="en-MY"/>
         </w:rPr>
-        <w:t>, Prof/Dr/Mr/Sir/Mr</w:t>
-      </w:r>
-      <w:r>
-        <w:rPr>
-          <w:rFonts w:ascii="Times New Roman" w:hAnsi="Times New Roman" w:cs="Times New Roman"/>
-          <w:b/>
-          <w:sz w:val="24"/>
-          <w:lang w:val="en-MY"/>
-        </w:rPr>
-        <w:t>s/Ms _______________</w:t>
-      </w:r>
-      <w:r>
-        <w:rPr>
-          <w:rFonts w:ascii="Times New Roman" w:hAnsi="Times New Roman" w:cs="Times New Roman"/>
-          <w:b/>
-          <w:sz w:val="24"/>
-          <w:lang w:val="en-MY"/>
-        </w:rPr>
-        <w:t>_</w:t>
-      </w:r>
-      <w:r>
-        <w:rPr>
-          <w:rFonts w:ascii="Times New Roman" w:hAnsi="Times New Roman" w:cs="Times New Roman"/>
-          <w:b/>
-          <w:sz w:val="24"/>
-          <w:lang w:val="en-MY"/>
-        </w:rPr>
-        <w:t>_______</w:t>
-      </w:r>
-      <w:r>
-        <w:rPr>
-          <w:rFonts w:ascii="Times New Roman" w:hAnsi="Times New Roman" w:cs="Times New Roman"/>
-          <w:b/>
-          <w:sz w:val="24"/>
-          <w:lang w:val="en-MY"/>
-        </w:rPr>
-        <w:t xml:space="preserve">___ </w:t>
+        <w:t xml:space="preserve">, Prof/Dr/Mr/Sir/Mrs/Ms __________________________ </w:t>
       </w:r>
       <w:r>
         <w:rPr>
@@ -3514,15 +3511,6 @@
           <w:lang w:val="en-MY"/>
         </w:rPr>
         <w:tab/>
-      </w:r>
-      <w:r>
-        <w:rPr>
-          <w:rFonts w:ascii="Times New Roman" w:hAnsi="Times New Roman" w:cs="Times New Roman"/>
-          <w:b/>
-          <w:sz w:val="24"/>
-          <w:lang w:val="en-MY"/>
-        </w:rPr>
-        <w:tab/>
         <w:t>________________________</w:t>
       </w:r>
     </w:p>
@@ -3648,9 +3636,82 @@
         </w:rPr>
       </w:pPr>
     </w:p>
+    <w:p/>
+    <w:p>
+      <w:pPr>
+        <w:rPr>
+          <w:rFonts w:ascii="Times New Roman" w:hAnsi="Times New Roman" w:cs="Times New Roman"/>
+          <w:sz w:val="24"/>
+        </w:rPr>
+      </w:pPr>
+    </w:p>
+    <w:p>
+      <w:pPr>
+        <w:pStyle w:val="ListParagraph"/>
+        <w:tabs>
+          <w:tab w:val="left" w:pos="1440"/>
+        </w:tabs>
+        <w:spacing w:line="360" w:lineRule="auto"/>
+        <w:rPr>
+          <w:rFonts w:ascii="Times New Roman" w:hAnsi="Times New Roman" w:cs="Times New Roman"/>
+          <w:b/>
+          <w:sz w:val="24"/>
+          <w:lang w:val="en-MY"/>
+        </w:rPr>
+      </w:pPr>
+    </w:p>
+    <w:p>
+      <w:pPr>
+        <w:pStyle w:val="ListParagraph"/>
+        <w:tabs>
+          <w:tab w:val="left" w:pos="1440"/>
+        </w:tabs>
+        <w:spacing w:line="360" w:lineRule="auto"/>
+        <w:rPr>
+          <w:rFonts w:ascii="Times New Roman" w:hAnsi="Times New Roman" w:cs="Times New Roman"/>
+          <w:b/>
+          <w:sz w:val="24"/>
+          <w:lang w:val="en-MY"/>
+        </w:rPr>
+      </w:pPr>
+    </w:p>
+    <w:p>
+      <w:pPr>
+        <w:pStyle w:val="ListParagraph"/>
+        <w:tabs>
+          <w:tab w:val="left" w:pos="1440"/>
+        </w:tabs>
+        <w:spacing w:line="360" w:lineRule="auto"/>
+        <w:rPr>
+          <w:rFonts w:ascii="Times New Roman" w:hAnsi="Times New Roman" w:cs="Times New Roman"/>
+          <w:b/>
+          <w:sz w:val="24"/>
+          <w:lang w:val="en-MY"/>
+        </w:rPr>
+      </w:pPr>
+    </w:p>
+    <w:p>
+      <w:pPr>
+        <w:tabs>
+          <w:tab w:val="left" w:pos="1440"/>
+        </w:tabs>
+        <w:spacing w:line="360" w:lineRule="auto"/>
+        <w:rPr>
+          <w:rFonts w:ascii="Times New Roman" w:hAnsi="Times New Roman" w:cs="Times New Roman"/>
+          <w:b/>
+          <w:sz w:val="24"/>
+          <w:lang w:val="en-MY"/>
+        </w:rPr>
+      </w:pPr>
+    </w:p>
+    <w:p/>
+    <w:p/>
+    <w:p/>
+    <w:p/>
+    <w:p/>
     <w:sectPr>
       <w:pgSz w:w="12240" w:h="15840"/>
-      <w:pgMar w:top="1080" w:right="540" w:bottom="1080" w:left="720" w:header="720" w:footer="720" w:gutter="0"/>
+      <w:pgMar w:top="1080" w:right="900" w:bottom="1080" w:left="990" w:header="720" w:footer="720" w:gutter="0"/>
       <w:cols w:space="720"/>
       <w:docGrid w:linePitch="360"/>
     </w:sectPr>
@@ -3661,20 +3722,132 @@
 <file path=word/numbering.xml><?xml version="1.0" encoding="utf-8"?>
 <w:numbering xmlns:wpc="http://schemas.microsoft.com/office/word/2010/wordprocessingCanvas" xmlns:mc="http://schemas.openxmlformats.org/markup-compatibility/2006" xmlns:o="urn:schemas-microsoft-com:office:office" xmlns:r="http://schemas.openxmlformats.org/officeDocument/2006/relationships" xmlns:m="http://schemas.openxmlformats.org/officeDocument/2006/math" xmlns:v="urn:schemas-microsoft-com:vml" xmlns:wp14="http://schemas.microsoft.com/office/word/2010/wordprocessingDrawing" xmlns:wp="http://schemas.openxmlformats.org/drawingml/2006/wordprocessingDrawing" xmlns:w10="urn:schemas-microsoft-com:office:word" xmlns:w="http://schemas.openxmlformats.org/wordprocessingml/2006/main" xmlns:w14="http://schemas.microsoft.com/office/word/2010/wordml" xmlns:wpg="http://schemas.microsoft.com/office/word/2010/wordprocessingGroup" xmlns:wpi="http://schemas.microsoft.com/office/word/2010/wordprocessingInk" xmlns:wne="http://schemas.microsoft.com/office/word/2006/wordml" xmlns:wps="http://schemas.microsoft.com/office/word/2010/wordprocessingShape" mc:Ignorable="w14 wp14">
   <w:abstractNum w:abstractNumId="0">
-    <w:nsid w:val="2ECD2394"/>
+    <w:nsid w:val="03C41F6E"/>
     <w:multiLevelType w:val="hybridMultilevel"/>
-    <w:tmpl w:val="B3984670"/>
-    <w:lvl w:ilvl="0" w:tplc="BEDC840E">
+    <w:tmpl w:val="F180589E"/>
+    <w:lvl w:ilvl="0" w:tplc="04090001">
+      <w:start w:val="1"/>
+      <w:numFmt w:val="bullet"/>
+      <w:lvlText w:val=""/>
+      <w:lvlJc w:val="left"/>
+      <w:pPr>
+        <w:ind w:left="2520" w:hanging="360"/>
+      </w:pPr>
+      <w:rPr>
+        <w:rFonts w:ascii="Symbol" w:hAnsi="Symbol" w:hint="default"/>
+      </w:rPr>
+    </w:lvl>
+    <w:lvl w:ilvl="1" w:tplc="04090003" w:tentative="1">
+      <w:start w:val="1"/>
+      <w:numFmt w:val="bullet"/>
+      <w:lvlText w:val="o"/>
+      <w:lvlJc w:val="left"/>
+      <w:pPr>
+        <w:ind w:left="3240" w:hanging="360"/>
+      </w:pPr>
+      <w:rPr>
+        <w:rFonts w:ascii="Courier New" w:hAnsi="Courier New" w:cs="Courier New" w:hint="default"/>
+      </w:rPr>
+    </w:lvl>
+    <w:lvl w:ilvl="2" w:tplc="04090005" w:tentative="1">
+      <w:start w:val="1"/>
+      <w:numFmt w:val="bullet"/>
+      <w:lvlText w:val=""/>
+      <w:lvlJc w:val="left"/>
+      <w:pPr>
+        <w:ind w:left="3960" w:hanging="360"/>
+      </w:pPr>
+      <w:rPr>
+        <w:rFonts w:ascii="Wingdings" w:hAnsi="Wingdings" w:hint="default"/>
+      </w:rPr>
+    </w:lvl>
+    <w:lvl w:ilvl="3" w:tplc="04090001" w:tentative="1">
+      <w:start w:val="1"/>
+      <w:numFmt w:val="bullet"/>
+      <w:lvlText w:val=""/>
+      <w:lvlJc w:val="left"/>
+      <w:pPr>
+        <w:ind w:left="4680" w:hanging="360"/>
+      </w:pPr>
+      <w:rPr>
+        <w:rFonts w:ascii="Symbol" w:hAnsi="Symbol" w:hint="default"/>
+      </w:rPr>
+    </w:lvl>
+    <w:lvl w:ilvl="4" w:tplc="04090003" w:tentative="1">
+      <w:start w:val="1"/>
+      <w:numFmt w:val="bullet"/>
+      <w:lvlText w:val="o"/>
+      <w:lvlJc w:val="left"/>
+      <w:pPr>
+        <w:ind w:left="5400" w:hanging="360"/>
+      </w:pPr>
+      <w:rPr>
+        <w:rFonts w:ascii="Courier New" w:hAnsi="Courier New" w:cs="Courier New" w:hint="default"/>
+      </w:rPr>
+    </w:lvl>
+    <w:lvl w:ilvl="5" w:tplc="04090005" w:tentative="1">
+      <w:start w:val="1"/>
+      <w:numFmt w:val="bullet"/>
+      <w:lvlText w:val=""/>
+      <w:lvlJc w:val="left"/>
+      <w:pPr>
+        <w:ind w:left="6120" w:hanging="360"/>
+      </w:pPr>
+      <w:rPr>
+        <w:rFonts w:ascii="Wingdings" w:hAnsi="Wingdings" w:hint="default"/>
+      </w:rPr>
+    </w:lvl>
+    <w:lvl w:ilvl="6" w:tplc="04090001" w:tentative="1">
+      <w:start w:val="1"/>
+      <w:numFmt w:val="bullet"/>
+      <w:lvlText w:val=""/>
+      <w:lvlJc w:val="left"/>
+      <w:pPr>
+        <w:ind w:left="6840" w:hanging="360"/>
+      </w:pPr>
+      <w:rPr>
+        <w:rFonts w:ascii="Symbol" w:hAnsi="Symbol" w:hint="default"/>
+      </w:rPr>
+    </w:lvl>
+    <w:lvl w:ilvl="7" w:tplc="04090003" w:tentative="1">
+      <w:start w:val="1"/>
+      <w:numFmt w:val="bullet"/>
+      <w:lvlText w:val="o"/>
+      <w:lvlJc w:val="left"/>
+      <w:pPr>
+        <w:ind w:left="7560" w:hanging="360"/>
+      </w:pPr>
+      <w:rPr>
+        <w:rFonts w:ascii="Courier New" w:hAnsi="Courier New" w:cs="Courier New" w:hint="default"/>
+      </w:rPr>
+    </w:lvl>
+    <w:lvl w:ilvl="8" w:tplc="04090005" w:tentative="1">
+      <w:start w:val="1"/>
+      <w:numFmt w:val="bullet"/>
+      <w:lvlText w:val=""/>
+      <w:lvlJc w:val="left"/>
+      <w:pPr>
+        <w:ind w:left="8280" w:hanging="360"/>
+      </w:pPr>
+      <w:rPr>
+        <w:rFonts w:ascii="Wingdings" w:hAnsi="Wingdings" w:hint="default"/>
+      </w:rPr>
+    </w:lvl>
+  </w:abstractNum>
+  <w:abstractNum w:abstractNumId="1">
+    <w:nsid w:val="54A9307C"/>
+    <w:multiLevelType w:val="hybridMultilevel"/>
+    <w:tmpl w:val="25940434"/>
+    <w:lvl w:ilvl="0" w:tplc="8196DC22">
       <w:start w:val="1"/>
       <w:numFmt w:val="lowerRoman"/>
       <w:lvlText w:val="%1."/>
-      <w:lvlJc w:val="left"/>
-      <w:pPr>
-        <w:ind w:left="1440" w:hanging="720"/>
+      <w:lvlJc w:val="right"/>
+      <w:pPr>
+        <w:ind w:left="720" w:hanging="360"/>
       </w:pPr>
       <w:rPr>
-        <w:rFonts w:hint="default"/>
-        <w:b w:val="0"/>
+        <w:b/>
       </w:rPr>
     </w:lvl>
     <w:lvl w:ilvl="1" w:tplc="04090019" w:tentative="1">
@@ -3683,7 +3856,7 @@
       <w:lvlText w:val="%2."/>
       <w:lvlJc w:val="left"/>
       <w:pPr>
-        <w:ind w:left="1800" w:hanging="360"/>
+        <w:ind w:left="1440" w:hanging="360"/>
       </w:pPr>
     </w:lvl>
     <w:lvl w:ilvl="2" w:tplc="0409001B" w:tentative="1">
@@ -3692,7 +3865,7 @@
       <w:lvlText w:val="%3."/>
       <w:lvlJc w:val="right"/>
       <w:pPr>
-        <w:ind w:left="2520" w:hanging="180"/>
+        <w:ind w:left="2160" w:hanging="180"/>
       </w:pPr>
     </w:lvl>
     <w:lvl w:ilvl="3" w:tplc="0409000F" w:tentative="1">
@@ -3701,7 +3874,7 @@
       <w:lvlText w:val="%4."/>
       <w:lvlJc w:val="left"/>
       <w:pPr>
-        <w:ind w:left="3240" w:hanging="360"/>
+        <w:ind w:left="2880" w:hanging="360"/>
       </w:pPr>
     </w:lvl>
     <w:lvl w:ilvl="4" w:tplc="04090019" w:tentative="1">
@@ -3710,7 +3883,7 @@
       <w:lvlText w:val="%5."/>
       <w:lvlJc w:val="left"/>
       <w:pPr>
-        <w:ind w:left="3960" w:hanging="360"/>
+        <w:ind w:left="3600" w:hanging="360"/>
       </w:pPr>
     </w:lvl>
     <w:lvl w:ilvl="5" w:tplc="0409001B" w:tentative="1">
@@ -3719,7 +3892,7 @@
       <w:lvlText w:val="%6."/>
       <w:lvlJc w:val="right"/>
       <w:pPr>
-        <w:ind w:left="4680" w:hanging="180"/>
+        <w:ind w:left="4320" w:hanging="180"/>
       </w:pPr>
     </w:lvl>
     <w:lvl w:ilvl="6" w:tplc="0409000F" w:tentative="1">
@@ -3728,7 +3901,7 @@
       <w:lvlText w:val="%7."/>
       <w:lvlJc w:val="left"/>
       <w:pPr>
-        <w:ind w:left="5400" w:hanging="360"/>
+        <w:ind w:left="5040" w:hanging="360"/>
       </w:pPr>
     </w:lvl>
     <w:lvl w:ilvl="7" w:tplc="04090019" w:tentative="1">
@@ -3737,7 +3910,7 @@
       <w:lvlText w:val="%8."/>
       <w:lvlJc w:val="left"/>
       <w:pPr>
-        <w:ind w:left="6120" w:hanging="360"/>
+        <w:ind w:left="5760" w:hanging="360"/>
       </w:pPr>
     </w:lvl>
     <w:lvl w:ilvl="8" w:tplc="0409001B" w:tentative="1">
@@ -3746,278 +3919,11 @@
       <w:lvlText w:val="%9."/>
       <w:lvlJc w:val="right"/>
       <w:pPr>
-        <w:ind w:left="6840" w:hanging="180"/>
-      </w:pPr>
-    </w:lvl>
-  </w:abstractNum>
-  <w:abstractNum w:abstractNumId="1">
-    <w:nsid w:val="31793C2E"/>
-    <w:multiLevelType w:val="hybridMultilevel"/>
-    <w:tmpl w:val="EC946DC8"/>
-    <w:lvl w:ilvl="0" w:tplc="0409000F">
-      <w:start w:val="1"/>
-      <w:numFmt w:val="decimal"/>
-      <w:lvlText w:val="%1."/>
-      <w:lvlJc w:val="left"/>
-      <w:pPr>
-        <w:ind w:left="406" w:hanging="360"/>
-      </w:pPr>
-    </w:lvl>
-    <w:lvl w:ilvl="1" w:tplc="04090019" w:tentative="1">
-      <w:start w:val="1"/>
-      <w:numFmt w:val="lowerLetter"/>
-      <w:lvlText w:val="%2."/>
-      <w:lvlJc w:val="left"/>
-      <w:pPr>
-        <w:ind w:left="1126" w:hanging="360"/>
-      </w:pPr>
-    </w:lvl>
-    <w:lvl w:ilvl="2" w:tplc="0409001B" w:tentative="1">
-      <w:start w:val="1"/>
-      <w:numFmt w:val="lowerRoman"/>
-      <w:lvlText w:val="%3."/>
-      <w:lvlJc w:val="right"/>
-      <w:pPr>
-        <w:ind w:left="1846" w:hanging="180"/>
-      </w:pPr>
-    </w:lvl>
-    <w:lvl w:ilvl="3" w:tplc="0409000F" w:tentative="1">
-      <w:start w:val="1"/>
-      <w:numFmt w:val="decimal"/>
-      <w:lvlText w:val="%4."/>
-      <w:lvlJc w:val="left"/>
-      <w:pPr>
-        <w:ind w:left="2566" w:hanging="360"/>
-      </w:pPr>
-    </w:lvl>
-    <w:lvl w:ilvl="4" w:tplc="04090019" w:tentative="1">
-      <w:start w:val="1"/>
-      <w:numFmt w:val="lowerLetter"/>
-      <w:lvlText w:val="%5."/>
-      <w:lvlJc w:val="left"/>
-      <w:pPr>
-        <w:ind w:left="3286" w:hanging="360"/>
-      </w:pPr>
-    </w:lvl>
-    <w:lvl w:ilvl="5" w:tplc="0409001B" w:tentative="1">
-      <w:start w:val="1"/>
-      <w:numFmt w:val="lowerRoman"/>
-      <w:lvlText w:val="%6."/>
-      <w:lvlJc w:val="right"/>
-      <w:pPr>
-        <w:ind w:left="4006" w:hanging="180"/>
-      </w:pPr>
-    </w:lvl>
-    <w:lvl w:ilvl="6" w:tplc="0409000F" w:tentative="1">
-      <w:start w:val="1"/>
-      <w:numFmt w:val="decimal"/>
-      <w:lvlText w:val="%7."/>
-      <w:lvlJc w:val="left"/>
-      <w:pPr>
-        <w:ind w:left="4726" w:hanging="360"/>
-      </w:pPr>
-    </w:lvl>
-    <w:lvl w:ilvl="7" w:tplc="04090019" w:tentative="1">
-      <w:start w:val="1"/>
-      <w:numFmt w:val="lowerLetter"/>
-      <w:lvlText w:val="%8."/>
-      <w:lvlJc w:val="left"/>
-      <w:pPr>
-        <w:ind w:left="5446" w:hanging="360"/>
-      </w:pPr>
-    </w:lvl>
-    <w:lvl w:ilvl="8" w:tplc="0409001B" w:tentative="1">
-      <w:start w:val="1"/>
-      <w:numFmt w:val="lowerRoman"/>
-      <w:lvlText w:val="%9."/>
-      <w:lvlJc w:val="right"/>
-      <w:pPr>
-        <w:ind w:left="6166" w:hanging="180"/>
+        <w:ind w:left="6480" w:hanging="180"/>
       </w:pPr>
     </w:lvl>
   </w:abstractNum>
   <w:abstractNum w:abstractNumId="2">
-    <w:nsid w:val="4427482D"/>
-    <w:multiLevelType w:val="hybridMultilevel"/>
-    <w:tmpl w:val="648A7E78"/>
-    <w:lvl w:ilvl="0" w:tplc="54722BD6">
-      <w:start w:val="1"/>
-      <w:numFmt w:val="lowerRoman"/>
-      <w:lvlText w:val="%1."/>
-      <w:lvlJc w:val="left"/>
-      <w:pPr>
-        <w:ind w:left="1440" w:hanging="720"/>
-      </w:pPr>
-      <w:rPr>
-        <w:rFonts w:hint="default"/>
-        <w:b w:val="0"/>
-      </w:rPr>
-    </w:lvl>
-    <w:lvl w:ilvl="1" w:tplc="04090019" w:tentative="1">
-      <w:start w:val="1"/>
-      <w:numFmt w:val="lowerLetter"/>
-      <w:lvlText w:val="%2."/>
-      <w:lvlJc w:val="left"/>
-      <w:pPr>
-        <w:ind w:left="1800" w:hanging="360"/>
-      </w:pPr>
-    </w:lvl>
-    <w:lvl w:ilvl="2" w:tplc="0409001B" w:tentative="1">
-      <w:start w:val="1"/>
-      <w:numFmt w:val="lowerRoman"/>
-      <w:lvlText w:val="%3."/>
-      <w:lvlJc w:val="right"/>
-      <w:pPr>
-        <w:ind w:left="2520" w:hanging="180"/>
-      </w:pPr>
-    </w:lvl>
-    <w:lvl w:ilvl="3" w:tplc="0409000F" w:tentative="1">
-      <w:start w:val="1"/>
-      <w:numFmt w:val="decimal"/>
-      <w:lvlText w:val="%4."/>
-      <w:lvlJc w:val="left"/>
-      <w:pPr>
-        <w:ind w:left="3240" w:hanging="360"/>
-      </w:pPr>
-    </w:lvl>
-    <w:lvl w:ilvl="4" w:tplc="04090019" w:tentative="1">
-      <w:start w:val="1"/>
-      <w:numFmt w:val="lowerLetter"/>
-      <w:lvlText w:val="%5."/>
-      <w:lvlJc w:val="left"/>
-      <w:pPr>
-        <w:ind w:left="3960" w:hanging="360"/>
-      </w:pPr>
-    </w:lvl>
-    <w:lvl w:ilvl="5" w:tplc="0409001B" w:tentative="1">
-      <w:start w:val="1"/>
-      <w:numFmt w:val="lowerRoman"/>
-      <w:lvlText w:val="%6."/>
-      <w:lvlJc w:val="right"/>
-      <w:pPr>
-        <w:ind w:left="4680" w:hanging="180"/>
-      </w:pPr>
-    </w:lvl>
-    <w:lvl w:ilvl="6" w:tplc="0409000F" w:tentative="1">
-      <w:start w:val="1"/>
-      <w:numFmt w:val="decimal"/>
-      <w:lvlText w:val="%7."/>
-      <w:lvlJc w:val="left"/>
-      <w:pPr>
-        <w:ind w:left="5400" w:hanging="360"/>
-      </w:pPr>
-    </w:lvl>
-    <w:lvl w:ilvl="7" w:tplc="04090019" w:tentative="1">
-      <w:start w:val="1"/>
-      <w:numFmt w:val="lowerLetter"/>
-      <w:lvlText w:val="%8."/>
-      <w:lvlJc w:val="left"/>
-      <w:pPr>
-        <w:ind w:left="6120" w:hanging="360"/>
-      </w:pPr>
-    </w:lvl>
-    <w:lvl w:ilvl="8" w:tplc="0409001B" w:tentative="1">
-      <w:start w:val="1"/>
-      <w:numFmt w:val="lowerRoman"/>
-      <w:lvlText w:val="%9."/>
-      <w:lvlJc w:val="right"/>
-      <w:pPr>
-        <w:ind w:left="6840" w:hanging="180"/>
-      </w:pPr>
-    </w:lvl>
-  </w:abstractNum>
-  <w:abstractNum w:abstractNumId="3">
-    <w:nsid w:val="444F43CF"/>
-    <w:multiLevelType w:val="hybridMultilevel"/>
-    <w:tmpl w:val="0AE66910"/>
-    <w:lvl w:ilvl="0" w:tplc="D51AE1CC">
-      <w:start w:val="1"/>
-      <w:numFmt w:val="lowerRoman"/>
-      <w:lvlText w:val="%1."/>
-      <w:lvlJc w:val="left"/>
-      <w:pPr>
-        <w:ind w:left="1440" w:hanging="720"/>
-      </w:pPr>
-      <w:rPr>
-        <w:rFonts w:eastAsia="Arial" w:hint="default"/>
-        <w:b w:val="0"/>
-        <w:sz w:val="24"/>
-      </w:rPr>
-    </w:lvl>
-    <w:lvl w:ilvl="1" w:tplc="04090019" w:tentative="1">
-      <w:start w:val="1"/>
-      <w:numFmt w:val="lowerLetter"/>
-      <w:lvlText w:val="%2."/>
-      <w:lvlJc w:val="left"/>
-      <w:pPr>
-        <w:ind w:left="1800" w:hanging="360"/>
-      </w:pPr>
-    </w:lvl>
-    <w:lvl w:ilvl="2" w:tplc="0409001B" w:tentative="1">
-      <w:start w:val="1"/>
-      <w:numFmt w:val="lowerRoman"/>
-      <w:lvlText w:val="%3."/>
-      <w:lvlJc w:val="right"/>
-      <w:pPr>
-        <w:ind w:left="2520" w:hanging="180"/>
-      </w:pPr>
-    </w:lvl>
-    <w:lvl w:ilvl="3" w:tplc="0409000F" w:tentative="1">
-      <w:start w:val="1"/>
-      <w:numFmt w:val="decimal"/>
-      <w:lvlText w:val="%4."/>
-      <w:lvlJc w:val="left"/>
-      <w:pPr>
-        <w:ind w:left="3240" w:hanging="360"/>
-      </w:pPr>
-    </w:lvl>
-    <w:lvl w:ilvl="4" w:tplc="04090019" w:tentative="1">
-      <w:start w:val="1"/>
-      <w:numFmt w:val="lowerLetter"/>
-      <w:lvlText w:val="%5."/>
-      <w:lvlJc w:val="left"/>
-      <w:pPr>
-        <w:ind w:left="3960" w:hanging="360"/>
-      </w:pPr>
-    </w:lvl>
-    <w:lvl w:ilvl="5" w:tplc="0409001B" w:tentative="1">
-      <w:start w:val="1"/>
-      <w:numFmt w:val="lowerRoman"/>
-      <w:lvlText w:val="%6."/>
-      <w:lvlJc w:val="right"/>
-      <w:pPr>
-        <w:ind w:left="4680" w:hanging="180"/>
-      </w:pPr>
-    </w:lvl>
-    <w:lvl w:ilvl="6" w:tplc="0409000F" w:tentative="1">
-      <w:start w:val="1"/>
-      <w:numFmt w:val="decimal"/>
-      <w:lvlText w:val="%7."/>
-      <w:lvlJc w:val="left"/>
-      <w:pPr>
-        <w:ind w:left="5400" w:hanging="360"/>
-      </w:pPr>
-    </w:lvl>
-    <w:lvl w:ilvl="7" w:tplc="04090019" w:tentative="1">
-      <w:start w:val="1"/>
-      <w:numFmt w:val="lowerLetter"/>
-      <w:lvlText w:val="%8."/>
-      <w:lvlJc w:val="left"/>
-      <w:pPr>
-        <w:ind w:left="6120" w:hanging="360"/>
-      </w:pPr>
-    </w:lvl>
-    <w:lvl w:ilvl="8" w:tplc="0409001B" w:tentative="1">
-      <w:start w:val="1"/>
-      <w:numFmt w:val="lowerRoman"/>
-      <w:lvlText w:val="%9."/>
-      <w:lvlJc w:val="right"/>
-      <w:pPr>
-        <w:ind w:left="6840" w:hanging="180"/>
-      </w:pPr>
-    </w:lvl>
-  </w:abstractNum>
-  <w:abstractNum w:abstractNumId="4">
     <w:nsid w:val="580E5250"/>
     <w:multiLevelType w:val="hybridMultilevel"/>
     <w:tmpl w:val="F1CE1C96"/>
@@ -4108,7 +4014,7 @@
       </w:pPr>
     </w:lvl>
   </w:abstractNum>
-  <w:abstractNum w:abstractNumId="5">
+  <w:abstractNum w:abstractNumId="3">
     <w:nsid w:val="7A682925"/>
     <w:multiLevelType w:val="hybridMultilevel"/>
     <w:tmpl w:val="BE7A076C"/>
@@ -4204,22 +4110,16 @@
     </w:lvl>
   </w:abstractNum>
   <w:num w:numId="1">
-    <w:abstractNumId w:val="5"/>
+    <w:abstractNumId w:val="3"/>
   </w:num>
   <w:num w:numId="2">
     <w:abstractNumId w:val="2"/>
   </w:num>
   <w:num w:numId="3">
-    <w:abstractNumId w:val="4"/>
+    <w:abstractNumId w:val="0"/>
   </w:num>
   <w:num w:numId="4">
     <w:abstractNumId w:val="1"/>
-  </w:num>
-  <w:num w:numId="5">
-    <w:abstractNumId w:val="0"/>
-  </w:num>
-  <w:num w:numId="6">
-    <w:abstractNumId w:val="3"/>
   </w:num>
 </w:numbering>
 </file>
@@ -4292,7 +4192,7 @@
     <w:lsdException w:name="Medium Shading 2 Accent 1" w:semiHidden="0" w:uiPriority="64" w:unhideWhenUsed="0"/>
     <w:lsdException w:name="Medium List 1 Accent 1" w:semiHidden="0" w:uiPriority="65" w:unhideWhenUsed="0"/>
     <w:lsdException w:name="Revision" w:unhideWhenUsed="0"/>
-    <w:lsdException w:name="List Paragraph" w:semiHidden="0" w:uiPriority="34" w:unhideWhenUsed="0" w:qFormat="1"/>
+    <w:lsdException w:name="List Paragraph" w:semiHidden="0" w:uiPriority="1" w:unhideWhenUsed="0" w:qFormat="1"/>
     <w:lsdException w:name="Quote" w:semiHidden="0" w:uiPriority="29" w:unhideWhenUsed="0" w:qFormat="1"/>
     <w:lsdException w:name="Intense Quote" w:semiHidden="0" w:uiPriority="30" w:unhideWhenUsed="0" w:qFormat="1"/>
     <w:lsdException w:name="Medium List 2 Accent 1" w:semiHidden="0" w:uiPriority="66" w:unhideWhenUsed="0"/>
@@ -4384,30 +4284,7 @@
   <w:style w:type="paragraph" w:default="1" w:styleId="Normal">
     <w:name w:val="Normal"/>
     <w:qFormat/>
-  </w:style>
-  <w:style w:type="paragraph" w:styleId="Heading2">
-    <w:name w:val="heading 2"/>
-    <w:basedOn w:val="Normal"/>
-    <w:link w:val="Heading2Char"/>
-    <w:uiPriority w:val="9"/>
-    <w:unhideWhenUsed/>
-    <w:qFormat/>
-    <w:rsid w:val="00E62733"/>
-    <w:pPr>
-      <w:widowControl w:val="0"/>
-      <w:autoSpaceDE w:val="0"/>
-      <w:autoSpaceDN w:val="0"/>
-      <w:spacing w:after="0" w:line="240" w:lineRule="auto"/>
-      <w:ind w:left="1440" w:hanging="360"/>
-      <w:outlineLvl w:val="1"/>
-    </w:pPr>
-    <w:rPr>
-      <w:rFonts w:ascii="Arial" w:eastAsia="Arial" w:hAnsi="Arial" w:cs="Arial"/>
-      <w:b/>
-      <w:bCs/>
-      <w:sz w:val="20"/>
-      <w:szCs w:val="20"/>
-    </w:rPr>
+    <w:rsid w:val="00460B8A"/>
   </w:style>
   <w:style w:type="character" w:default="1" w:styleId="DefaultParagraphFont">
     <w:name w:val="Default Paragraph Font"/>
@@ -4436,23 +4313,9 @@
     <w:semiHidden/>
     <w:unhideWhenUsed/>
   </w:style>
-  <w:style w:type="character" w:customStyle="1" w:styleId="Heading2Char">
-    <w:name w:val="Heading 2 Char"/>
-    <w:basedOn w:val="DefaultParagraphFont"/>
-    <w:link w:val="Heading2"/>
-    <w:uiPriority w:val="9"/>
-    <w:rsid w:val="00E62733"/>
-    <w:rPr>
-      <w:rFonts w:ascii="Arial" w:eastAsia="Arial" w:hAnsi="Arial" w:cs="Arial"/>
-      <w:b/>
-      <w:bCs/>
-      <w:sz w:val="20"/>
-      <w:szCs w:val="20"/>
-    </w:rPr>
-  </w:style>
   <w:style w:type="paragraph" w:customStyle="1" w:styleId="Normal1">
     <w:name w:val="Normal1"/>
-    <w:rsid w:val="00E62733"/>
+    <w:rsid w:val="00460B8A"/>
     <w:pPr>
       <w:spacing w:after="160" w:line="259" w:lineRule="auto"/>
     </w:pPr>
@@ -4464,9 +4327,9 @@
   <w:style w:type="paragraph" w:styleId="ListParagraph">
     <w:name w:val="List Paragraph"/>
     <w:basedOn w:val="Normal"/>
-    <w:uiPriority w:val="34"/>
+    <w:uiPriority w:val="1"/>
     <w:qFormat/>
-    <w:rsid w:val="00E62733"/>
+    <w:rsid w:val="00460B8A"/>
     <w:pPr>
       <w:ind w:left="720"/>
       <w:contextualSpacing/>
@@ -4476,7 +4339,7 @@
     <w:name w:val="Table Grid"/>
     <w:basedOn w:val="TableNormal"/>
     <w:uiPriority w:val="59"/>
-    <w:rsid w:val="0082021F"/>
+    <w:rsid w:val="00460B8A"/>
     <w:pPr>
       <w:spacing w:after="0" w:line="240" w:lineRule="auto"/>
     </w:pPr>
@@ -4497,36 +4360,6 @@
         <w:right w:w="108" w:type="dxa"/>
       </w:tblCellMar>
     </w:tblPr>
-  </w:style>
-  <w:style w:type="paragraph" w:styleId="BalloonText">
-    <w:name w:val="Balloon Text"/>
-    <w:basedOn w:val="Normal"/>
-    <w:link w:val="BalloonTextChar"/>
-    <w:uiPriority w:val="99"/>
-    <w:semiHidden/>
-    <w:unhideWhenUsed/>
-    <w:rsid w:val="00291B04"/>
-    <w:pPr>
-      <w:spacing w:after="0" w:line="240" w:lineRule="auto"/>
-    </w:pPr>
-    <w:rPr>
-      <w:rFonts w:ascii="Tahoma" w:hAnsi="Tahoma" w:cs="Tahoma"/>
-      <w:sz w:val="16"/>
-      <w:szCs w:val="16"/>
-    </w:rPr>
-  </w:style>
-  <w:style w:type="character" w:customStyle="1" w:styleId="BalloonTextChar">
-    <w:name w:val="Balloon Text Char"/>
-    <w:basedOn w:val="DefaultParagraphFont"/>
-    <w:link w:val="BalloonText"/>
-    <w:uiPriority w:val="99"/>
-    <w:semiHidden/>
-    <w:rsid w:val="00291B04"/>
-    <w:rPr>
-      <w:rFonts w:ascii="Tahoma" w:hAnsi="Tahoma" w:cs="Tahoma"/>
-      <w:sz w:val="16"/>
-      <w:szCs w:val="16"/>
-    </w:rPr>
   </w:style>
 </w:styles>
 </file>
@@ -4598,7 +4431,7 @@
     <w:lsdException w:name="Medium Shading 2 Accent 1" w:semiHidden="0" w:uiPriority="64" w:unhideWhenUsed="0"/>
     <w:lsdException w:name="Medium List 1 Accent 1" w:semiHidden="0" w:uiPriority="65" w:unhideWhenUsed="0"/>
     <w:lsdException w:name="Revision" w:unhideWhenUsed="0"/>
-    <w:lsdException w:name="List Paragraph" w:semiHidden="0" w:uiPriority="34" w:unhideWhenUsed="0" w:qFormat="1"/>
+    <w:lsdException w:name="List Paragraph" w:semiHidden="0" w:uiPriority="1" w:unhideWhenUsed="0" w:qFormat="1"/>
     <w:lsdException w:name="Quote" w:semiHidden="0" w:uiPriority="29" w:unhideWhenUsed="0" w:qFormat="1"/>
     <w:lsdException w:name="Intense Quote" w:semiHidden="0" w:uiPriority="30" w:unhideWhenUsed="0" w:qFormat="1"/>
     <w:lsdException w:name="Medium List 2 Accent 1" w:semiHidden="0" w:uiPriority="66" w:unhideWhenUsed="0"/>
@@ -4690,30 +4523,7 @@
   <w:style w:type="paragraph" w:default="1" w:styleId="Normal">
     <w:name w:val="Normal"/>
     <w:qFormat/>
-  </w:style>
-  <w:style w:type="paragraph" w:styleId="Heading2">
-    <w:name w:val="heading 2"/>
-    <w:basedOn w:val="Normal"/>
-    <w:link w:val="Heading2Char"/>
-    <w:uiPriority w:val="9"/>
-    <w:unhideWhenUsed/>
-    <w:qFormat/>
-    <w:rsid w:val="00E62733"/>
-    <w:pPr>
-      <w:widowControl w:val="0"/>
-      <w:autoSpaceDE w:val="0"/>
-      <w:autoSpaceDN w:val="0"/>
-      <w:spacing w:after="0" w:line="240" w:lineRule="auto"/>
-      <w:ind w:left="1440" w:hanging="360"/>
-      <w:outlineLvl w:val="1"/>
-    </w:pPr>
-    <w:rPr>
-      <w:rFonts w:ascii="Arial" w:eastAsia="Arial" w:hAnsi="Arial" w:cs="Arial"/>
-      <w:b/>
-      <w:bCs/>
-      <w:sz w:val="20"/>
-      <w:szCs w:val="20"/>
-    </w:rPr>
+    <w:rsid w:val="00460B8A"/>
   </w:style>
   <w:style w:type="character" w:default="1" w:styleId="DefaultParagraphFont">
     <w:name w:val="Default Paragraph Font"/>
@@ -4742,23 +4552,9 @@
     <w:semiHidden/>
     <w:unhideWhenUsed/>
   </w:style>
-  <w:style w:type="character" w:customStyle="1" w:styleId="Heading2Char">
-    <w:name w:val="Heading 2 Char"/>
-    <w:basedOn w:val="DefaultParagraphFont"/>
-    <w:link w:val="Heading2"/>
-    <w:uiPriority w:val="9"/>
-    <w:rsid w:val="00E62733"/>
-    <w:rPr>
-      <w:rFonts w:ascii="Arial" w:eastAsia="Arial" w:hAnsi="Arial" w:cs="Arial"/>
-      <w:b/>
-      <w:bCs/>
-      <w:sz w:val="20"/>
-      <w:szCs w:val="20"/>
-    </w:rPr>
-  </w:style>
   <w:style w:type="paragraph" w:customStyle="1" w:styleId="Normal1">
     <w:name w:val="Normal1"/>
-    <w:rsid w:val="00E62733"/>
+    <w:rsid w:val="00460B8A"/>
     <w:pPr>
       <w:spacing w:after="160" w:line="259" w:lineRule="auto"/>
     </w:pPr>
@@ -4770,9 +4566,9 @@
   <w:style w:type="paragraph" w:styleId="ListParagraph">
     <w:name w:val="List Paragraph"/>
     <w:basedOn w:val="Normal"/>
-    <w:uiPriority w:val="34"/>
+    <w:uiPriority w:val="1"/>
     <w:qFormat/>
-    <w:rsid w:val="00E62733"/>
+    <w:rsid w:val="00460B8A"/>
     <w:pPr>
       <w:ind w:left="720"/>
       <w:contextualSpacing/>
@@ -4782,7 +4578,7 @@
     <w:name w:val="Table Grid"/>
     <w:basedOn w:val="TableNormal"/>
     <w:uiPriority w:val="59"/>
-    <w:rsid w:val="0082021F"/>
+    <w:rsid w:val="00460B8A"/>
     <w:pPr>
       <w:spacing w:after="0" w:line="240" w:lineRule="auto"/>
     </w:pPr>
@@ -4803,36 +4599,6 @@
         <w:right w:w="108" w:type="dxa"/>
       </w:tblCellMar>
     </w:tblPr>
-  </w:style>
-  <w:style w:type="paragraph" w:styleId="BalloonText">
-    <w:name w:val="Balloon Text"/>
-    <w:basedOn w:val="Normal"/>
-    <w:link w:val="BalloonTextChar"/>
-    <w:uiPriority w:val="99"/>
-    <w:semiHidden/>
-    <w:unhideWhenUsed/>
-    <w:rsid w:val="00291B04"/>
-    <w:pPr>
-      <w:spacing w:after="0" w:line="240" w:lineRule="auto"/>
-    </w:pPr>
-    <w:rPr>
-      <w:rFonts w:ascii="Tahoma" w:hAnsi="Tahoma" w:cs="Tahoma"/>
-      <w:sz w:val="16"/>
-      <w:szCs w:val="16"/>
-    </w:rPr>
-  </w:style>
-  <w:style w:type="character" w:customStyle="1" w:styleId="BalloonTextChar">
-    <w:name w:val="Balloon Text Char"/>
-    <w:basedOn w:val="DefaultParagraphFont"/>
-    <w:link w:val="BalloonText"/>
-    <w:uiPriority w:val="99"/>
-    <w:semiHidden/>
-    <w:rsid w:val="00291B04"/>
-    <w:rPr>
-      <w:rFonts w:ascii="Tahoma" w:hAnsi="Tahoma" w:cs="Tahoma"/>
-      <w:sz w:val="16"/>
-      <w:szCs w:val="16"/>
-    </w:rPr>
   </w:style>
 </w:styles>
 </file>

</xml_diff>

<commit_message>
Contracts: email + dashboard notice, editable duties per staff type, correct expiry wording
- Issued contracts are emailed to the staff member (docx attached) and shown as a
  dashboard notice until downloaded; HR sees a Staff Download column.
- Issue Contract asks for Academic / Non-academic staff and fills an editable
  Duties box from contract-templates/default-duties.php; the three campus letters
  repeat one bullet per duty.
- Contract expiry: 'expires today / in N days / expired N days ago' with the date,
  via ContractExpiry (Nigerian time), instead of 'will be terminated N days ago'.
- Annual leave migration: 1-7 days per request.

Co-Authored-By: Claude Sonnet 5.5 <noreply@anthropic.com>
</commit_message>
<xml_diff>
--- a/contract-templates/Abuja_Template.docx
+++ b/contract-templates/Abuja_Template.docx
@@ -1135,225 +1135,7 @@
           <w:sz w:val="24"/>
           <w:szCs w:val="24"/>
         </w:rPr>
-        <w:t xml:space="preserve">Prepare and manage the institution’s budget and financial plans. </w:t>
-      </w:r>
-    </w:p>
-    <w:p>
-      <w:pPr>
-        <w:pStyle w:val="ListParagraph"/>
-        <w:numPr>
-          <w:ilvl w:val="0"/>
-          <w:numId w:val="4"/>
-        </w:numPr>
-        <w:spacing w:after="0" w:line="360" w:lineRule="auto"/>
-        <w:ind w:left="1440" w:hanging="540"/>
-        <w:rPr>
-          <w:rFonts w:ascii="Times New Roman" w:eastAsia="Times New Roman" w:hAnsi="Times New Roman" w:cs="Times New Roman"/>
-          <w:sz w:val="24"/>
-          <w:szCs w:val="24"/>
-        </w:rPr>
-      </w:pPr>
-      <w:r>
-        <w:rPr>
-          <w:rFonts w:ascii="Times New Roman" w:eastAsia="Times New Roman" w:hAnsi="Times New Roman" w:cs="Times New Roman"/>
-          <w:sz w:val="24"/>
-          <w:szCs w:val="24"/>
-        </w:rPr>
-        <w:t xml:space="preserve">Maintain accurate records of all financial transactions and ensure proper documentation. </w:t>
-      </w:r>
-    </w:p>
-    <w:p>
-      <w:pPr>
-        <w:pStyle w:val="ListParagraph"/>
-        <w:numPr>
-          <w:ilvl w:val="0"/>
-          <w:numId w:val="4"/>
-        </w:numPr>
-        <w:spacing w:after="0" w:line="360" w:lineRule="auto"/>
-        <w:ind w:left="1440" w:hanging="540"/>
-        <w:rPr>
-          <w:rFonts w:ascii="Times New Roman" w:eastAsia="Times New Roman" w:hAnsi="Times New Roman" w:cs="Times New Roman"/>
-          <w:sz w:val="24"/>
-          <w:szCs w:val="24"/>
-        </w:rPr>
-      </w:pPr>
-      <w:r>
-        <w:rPr>
-          <w:rFonts w:ascii="Times New Roman" w:eastAsia="Times New Roman" w:hAnsi="Times New Roman" w:cs="Times New Roman"/>
-          <w:sz w:val="24"/>
-          <w:szCs w:val="24"/>
-        </w:rPr>
-        <w:t xml:space="preserve">Monitor daily income and expenditure to ensure effective cash flow management. </w:t>
-      </w:r>
-    </w:p>
-    <w:p>
-      <w:pPr>
-        <w:pStyle w:val="ListParagraph"/>
-        <w:numPr>
-          <w:ilvl w:val="0"/>
-          <w:numId w:val="4"/>
-        </w:numPr>
-        <w:spacing w:after="0" w:line="360" w:lineRule="auto"/>
-        <w:ind w:left="1440" w:hanging="540"/>
-        <w:rPr>
-          <w:rFonts w:ascii="Times New Roman" w:eastAsia="Times New Roman" w:hAnsi="Times New Roman" w:cs="Times New Roman"/>
-          <w:sz w:val="24"/>
-          <w:szCs w:val="24"/>
-        </w:rPr>
-      </w:pPr>
-      <w:r>
-        <w:rPr>
-          <w:rFonts w:ascii="Times New Roman" w:eastAsia="Times New Roman" w:hAnsi="Times New Roman" w:cs="Times New Roman"/>
-          <w:sz w:val="24"/>
-          <w:szCs w:val="24"/>
-        </w:rPr>
-        <w:t xml:space="preserve">Prepare monthly, quarterly, and annual financial reports for management review. </w:t>
-      </w:r>
-    </w:p>
-    <w:p>
-      <w:pPr>
-        <w:pStyle w:val="ListParagraph"/>
-        <w:numPr>
-          <w:ilvl w:val="0"/>
-          <w:numId w:val="4"/>
-        </w:numPr>
-        <w:spacing w:after="0" w:line="360" w:lineRule="auto"/>
-        <w:ind w:left="1440" w:hanging="540"/>
-        <w:rPr>
-          <w:rFonts w:ascii="Times New Roman" w:eastAsia="Times New Roman" w:hAnsi="Times New Roman" w:cs="Times New Roman"/>
-          <w:sz w:val="24"/>
-          <w:szCs w:val="24"/>
-        </w:rPr>
-      </w:pPr>
-      <w:r>
-        <w:rPr>
-          <w:rFonts w:ascii="Times New Roman" w:eastAsia="Times New Roman" w:hAnsi="Times New Roman" w:cs="Times New Roman"/>
-          <w:sz w:val="24"/>
-          <w:szCs w:val="24"/>
-        </w:rPr>
-        <w:t xml:space="preserve">Supervise the collection of fees, revenues, and other institutional payments. </w:t>
-      </w:r>
-    </w:p>
-    <w:p>
-      <w:pPr>
-        <w:pStyle w:val="ListParagraph"/>
-        <w:numPr>
-          <w:ilvl w:val="0"/>
-          <w:numId w:val="4"/>
-        </w:numPr>
-        <w:spacing w:after="0" w:line="360" w:lineRule="auto"/>
-        <w:ind w:left="1440" w:hanging="540"/>
-        <w:rPr>
-          <w:rFonts w:ascii="Times New Roman" w:eastAsia="Times New Roman" w:hAnsi="Times New Roman" w:cs="Times New Roman"/>
-          <w:sz w:val="24"/>
-          <w:szCs w:val="24"/>
-        </w:rPr>
-      </w:pPr>
-      <w:r>
-        <w:rPr>
-          <w:rFonts w:ascii="Times New Roman" w:eastAsia="Times New Roman" w:hAnsi="Times New Roman" w:cs="Times New Roman"/>
-          <w:sz w:val="24"/>
-          <w:szCs w:val="24"/>
-        </w:rPr>
-        <w:t xml:space="preserve">Process payments for vendors, contractors, and other financial obligations of the institution. </w:t>
-      </w:r>
-    </w:p>
-    <w:p>
-      <w:pPr>
-        <w:pStyle w:val="ListParagraph"/>
-        <w:numPr>
-          <w:ilvl w:val="0"/>
-          <w:numId w:val="4"/>
-        </w:numPr>
-        <w:spacing w:after="0" w:line="360" w:lineRule="auto"/>
-        <w:ind w:left="1440" w:hanging="540"/>
-        <w:rPr>
-          <w:rFonts w:ascii="Times New Roman" w:eastAsia="Times New Roman" w:hAnsi="Times New Roman" w:cs="Times New Roman"/>
-          <w:sz w:val="24"/>
-          <w:szCs w:val="24"/>
-        </w:rPr>
-      </w:pPr>
-      <w:r>
-        <w:rPr>
-          <w:rFonts w:ascii="Times New Roman" w:eastAsia="Times New Roman" w:hAnsi="Times New Roman" w:cs="Times New Roman"/>
-          <w:sz w:val="24"/>
-          <w:szCs w:val="24"/>
-        </w:rPr>
-        <w:t xml:space="preserve">Ensure compliance with financial policies, procedures, and statutory regulations. </w:t>
-      </w:r>
-    </w:p>
-    <w:p>
-      <w:pPr>
-        <w:pStyle w:val="ListParagraph"/>
-        <w:numPr>
-          <w:ilvl w:val="0"/>
-          <w:numId w:val="4"/>
-        </w:numPr>
-        <w:spacing w:after="0" w:line="360" w:lineRule="auto"/>
-        <w:ind w:left="1440" w:hanging="540"/>
-        <w:rPr>
-          <w:rFonts w:ascii="Times New Roman" w:eastAsia="Times New Roman" w:hAnsi="Times New Roman" w:cs="Times New Roman"/>
-          <w:sz w:val="24"/>
-          <w:szCs w:val="24"/>
-        </w:rPr>
-      </w:pPr>
-      <w:r>
-        <w:rPr>
-          <w:rFonts w:ascii="Times New Roman" w:eastAsia="Times New Roman" w:hAnsi="Times New Roman" w:cs="Times New Roman"/>
-          <w:sz w:val="24"/>
-          <w:szCs w:val="24"/>
-        </w:rPr>
-        <w:t xml:space="preserve">Coordinate internal and external audits and provide all required financial records. </w:t>
-      </w:r>
-    </w:p>
-    <w:p>
-      <w:pPr>
-        <w:pStyle w:val="ListParagraph"/>
-        <w:numPr>
-          <w:ilvl w:val="0"/>
-          <w:numId w:val="4"/>
-        </w:numPr>
-        <w:spacing w:after="0" w:line="360" w:lineRule="auto"/>
-        <w:ind w:left="1440" w:hanging="540"/>
-        <w:rPr>
-          <w:rFonts w:ascii="Times New Roman" w:eastAsia="Times New Roman" w:hAnsi="Times New Roman" w:cs="Times New Roman"/>
-          <w:sz w:val="24"/>
-          <w:szCs w:val="24"/>
-        </w:rPr>
-      </w:pPr>
-      <w:r>
-        <w:rPr>
-          <w:rFonts w:ascii="Times New Roman" w:eastAsia="Times New Roman" w:hAnsi="Times New Roman" w:cs="Times New Roman"/>
-          <w:sz w:val="24"/>
-          <w:szCs w:val="24"/>
-        </w:rPr>
-        <w:t xml:space="preserve">Monitor bank transactions and reconcile financial statements regularly. </w:t>
-      </w:r>
-    </w:p>
-    <w:p>
-      <w:pPr>
-        <w:pStyle w:val="ListParagraph"/>
-        <w:numPr>
-          <w:ilvl w:val="0"/>
-          <w:numId w:val="4"/>
-        </w:numPr>
-        <w:tabs>
-          <w:tab w:val="left" w:pos="1440"/>
-        </w:tabs>
-        <w:spacing w:line="480" w:lineRule="auto"/>
-        <w:ind w:left="1440" w:hanging="540"/>
-        <w:rPr>
-          <w:rFonts w:ascii="Times New Roman" w:hAnsi="Times New Roman" w:cs="Times New Roman"/>
-          <w:sz w:val="24"/>
-        </w:rPr>
-      </w:pPr>
-      <w:r>
-        <w:rPr>
-          <w:rFonts w:ascii="Times New Roman" w:eastAsia="Times New Roman" w:hAnsi="Times New Roman" w:cs="Times New Roman"/>
-          <w:sz w:val="24"/>
-          <w:szCs w:val="24"/>
-        </w:rPr>
-        <w:t>Perform any other financial or administrative duties as may be assigned by Management.</w:t>
+        <w:t xml:space="preserve">@@DUTIES@@</w:t>
       </w:r>
     </w:p>
     <w:p>

</xml_diff>